<commit_message>
Add postgreSQL test connection
</commit_message>
<xml_diff>
--- a/todolist_crypto.docx
+++ b/todolist_crypto.docx
@@ -1195,7 +1195,7 @@
           <w14:ligatures w14:val="none"/>
         </w:rPr>
         <w:pict w14:anchorId="549BC596">
-          <v:rect id="_x0000_i1043" style="width:0;height:1.5pt" o:hralign="center" o:hrstd="t" o:hr="t" fillcolor="#a0a0a0" stroked="f"/>
+          <v:rect id="_x0000_i1025" style="width:0;height:1.5pt" o:hralign="center" o:hrstd="t" o:hr="t" fillcolor="#a0a0a0" stroked="f"/>
         </w:pict>
       </w:r>
     </w:p>
@@ -1600,7 +1600,7 @@
           <w14:ligatures w14:val="none"/>
         </w:rPr>
         <w:pict w14:anchorId="76F7F464">
-          <v:rect id="_x0000_i1044" style="width:0;height:1.5pt" o:hralign="center" o:hrstd="t" o:hr="t" fillcolor="#a0a0a0" stroked="f"/>
+          <v:rect id="_x0000_i1026" style="width:0;height:1.5pt" o:hralign="center" o:hrstd="t" o:hr="t" fillcolor="#a0a0a0" stroked="f"/>
         </w:pict>
       </w:r>
     </w:p>
@@ -1850,7 +1850,7 @@
           <w14:ligatures w14:val="none"/>
         </w:rPr>
         <w:pict w14:anchorId="2167858F">
-          <v:rect id="_x0000_i1045" style="width:0;height:1.5pt" o:hralign="center" o:hrstd="t" o:hr="t" fillcolor="#a0a0a0" stroked="f"/>
+          <v:rect id="_x0000_i1027" style="width:0;height:1.5pt" o:hralign="center" o:hrstd="t" o:hr="t" fillcolor="#a0a0a0" stroked="f"/>
         </w:pict>
       </w:r>
     </w:p>
@@ -3148,6 +3148,1945 @@
           <w14:ligatures w14:val="none"/>
         </w:rPr>
         <w:br w:type="page"/>
+      </w:r>
+    </w:p>
+    <w:p>
+      <w:pPr>
+        <w:spacing w:before="100" w:beforeAutospacing="1" w:after="100" w:afterAutospacing="1" w:line="240" w:lineRule="auto"/>
+        <w:rPr>
+          <w:rFonts w:ascii="Times New Roman" w:eastAsia="Times New Roman" w:hAnsi="Times New Roman" w:cs="Times New Roman"/>
+          <w:kern w:val="0"/>
+          <w14:ligatures w14:val="none"/>
+        </w:rPr>
+      </w:pPr>
+      <w:r>
+        <w:rPr>
+          <w:rFonts w:ascii="Times New Roman" w:eastAsia="Times New Roman" w:hAnsi="Times New Roman" w:cs="Times New Roman"/>
+          <w:kern w:val="0"/>
+          <w14:ligatures w14:val="none"/>
+        </w:rPr>
+        <w:lastRenderedPageBreak/>
+        <w:t xml:space="preserve">Great question Yu Han — this is exactly the </w:t>
+      </w:r>
+      <w:r>
+        <w:rPr>
+          <w:rFonts w:ascii="Times New Roman" w:eastAsia="Times New Roman" w:hAnsi="Times New Roman" w:cs="Times New Roman"/>
+          <w:b/>
+          <w:bCs/>
+          <w:kern w:val="0"/>
+          <w14:ligatures w14:val="none"/>
+        </w:rPr>
+        <w:t>next level that turns a student script into a real data engineering project</w:t>
+      </w:r>
+      <w:r>
+        <w:rPr>
+          <w:rFonts w:ascii="Times New Roman" w:eastAsia="Times New Roman" w:hAnsi="Times New Roman" w:cs="Times New Roman"/>
+          <w:kern w:val="0"/>
+          <w14:ligatures w14:val="none"/>
+        </w:rPr>
+        <w:t xml:space="preserve">. </w:t>
+      </w:r>
+      <w:r>
+        <w:rPr>
+          <w:rFonts w:ascii="Segoe UI Emoji" w:eastAsia="Times New Roman" w:hAnsi="Segoe UI Emoji" w:cs="Segoe UI Emoji"/>
+          <w:kern w:val="0"/>
+          <w14:ligatures w14:val="none"/>
+        </w:rPr>
+        <w:t>🚀</w:t>
+      </w:r>
+    </w:p>
+    <w:p>
+      <w:pPr>
+        <w:spacing w:before="100" w:beforeAutospacing="1" w:after="100" w:afterAutospacing="1" w:line="240" w:lineRule="auto"/>
+        <w:rPr>
+          <w:rFonts w:ascii="Times New Roman" w:eastAsia="Times New Roman" w:hAnsi="Times New Roman" w:cs="Times New Roman"/>
+          <w:kern w:val="0"/>
+          <w14:ligatures w14:val="none"/>
+        </w:rPr>
+      </w:pPr>
+      <w:r>
+        <w:rPr>
+          <w:rFonts w:ascii="Times New Roman" w:eastAsia="Times New Roman" w:hAnsi="Times New Roman" w:cs="Times New Roman"/>
+          <w:kern w:val="0"/>
+          <w14:ligatures w14:val="none"/>
+        </w:rPr>
+        <w:t xml:space="preserve">Right </w:t>
+      </w:r>
+      <w:proofErr w:type="gramStart"/>
+      <w:r>
+        <w:rPr>
+          <w:rFonts w:ascii="Times New Roman" w:eastAsia="Times New Roman" w:hAnsi="Times New Roman" w:cs="Times New Roman"/>
+          <w:kern w:val="0"/>
+          <w14:ligatures w14:val="none"/>
+        </w:rPr>
+        <w:t>now</w:t>
+      </w:r>
+      <w:proofErr w:type="gramEnd"/>
+      <w:r>
+        <w:rPr>
+          <w:rFonts w:ascii="Times New Roman" w:eastAsia="Times New Roman" w:hAnsi="Times New Roman" w:cs="Times New Roman"/>
+          <w:kern w:val="0"/>
+          <w14:ligatures w14:val="none"/>
+        </w:rPr>
+        <w:t xml:space="preserve"> your project is basically:</w:t>
+      </w:r>
+    </w:p>
+    <w:p>
+      <w:pPr>
+        <w:spacing w:before="100" w:beforeAutospacing="1" w:after="100" w:afterAutospacing="1" w:line="240" w:lineRule="auto"/>
+        <w:rPr>
+          <w:rFonts w:ascii="Times New Roman" w:eastAsia="Times New Roman" w:hAnsi="Times New Roman" w:cs="Times New Roman"/>
+          <w:kern w:val="0"/>
+          <w14:ligatures w14:val="none"/>
+        </w:rPr>
+      </w:pPr>
+      <w:r>
+        <w:rPr>
+          <w:rFonts w:ascii="Times New Roman" w:eastAsia="Times New Roman" w:hAnsi="Times New Roman" w:cs="Times New Roman"/>
+          <w:kern w:val="0"/>
+          <w14:ligatures w14:val="none"/>
+        </w:rPr>
+        <w:t>API → Python script → CSV file</w:t>
+      </w:r>
+    </w:p>
+    <w:p>
+      <w:pPr>
+        <w:spacing w:before="100" w:beforeAutospacing="1" w:after="100" w:afterAutospacing="1" w:line="240" w:lineRule="auto"/>
+        <w:rPr>
+          <w:rFonts w:ascii="Times New Roman" w:eastAsia="Times New Roman" w:hAnsi="Times New Roman" w:cs="Times New Roman"/>
+          <w:kern w:val="0"/>
+          <w14:ligatures w14:val="none"/>
+        </w:rPr>
+      </w:pPr>
+      <w:r>
+        <w:rPr>
+          <w:rFonts w:ascii="Times New Roman" w:eastAsia="Times New Roman" w:hAnsi="Times New Roman" w:cs="Times New Roman"/>
+          <w:kern w:val="0"/>
+          <w14:ligatures w14:val="none"/>
+        </w:rPr>
+        <w:t>But in real companies, pipelines usually look like this:</w:t>
+      </w:r>
+    </w:p>
+    <w:p>
+      <w:pPr>
+        <w:spacing w:before="100" w:beforeAutospacing="1" w:after="100" w:afterAutospacing="1" w:line="240" w:lineRule="auto"/>
+        <w:rPr>
+          <w:rFonts w:ascii="Times New Roman" w:eastAsia="Times New Roman" w:hAnsi="Times New Roman" w:cs="Times New Roman"/>
+          <w:kern w:val="0"/>
+          <w14:ligatures w14:val="none"/>
+        </w:rPr>
+      </w:pPr>
+      <w:r>
+        <w:rPr>
+          <w:rFonts w:ascii="Times New Roman" w:eastAsia="Times New Roman" w:hAnsi="Times New Roman" w:cs="Times New Roman"/>
+          <w:kern w:val="0"/>
+          <w14:ligatures w14:val="none"/>
+        </w:rPr>
+        <w:t>API → ETL Pipeline → Database → Scheduler → Dashboard</w:t>
+      </w:r>
+    </w:p>
+    <w:p>
+      <w:pPr>
+        <w:spacing w:before="100" w:beforeAutospacing="1" w:after="100" w:afterAutospacing="1" w:line="240" w:lineRule="auto"/>
+        <w:rPr>
+          <w:rFonts w:ascii="Times New Roman" w:eastAsia="Times New Roman" w:hAnsi="Times New Roman" w:cs="Times New Roman"/>
+          <w:kern w:val="0"/>
+          <w14:ligatures w14:val="none"/>
+        </w:rPr>
+      </w:pPr>
+      <w:r>
+        <w:rPr>
+          <w:rFonts w:ascii="Times New Roman" w:eastAsia="Times New Roman" w:hAnsi="Times New Roman" w:cs="Times New Roman"/>
+          <w:kern w:val="0"/>
+          <w14:ligatures w14:val="none"/>
+        </w:rPr>
+        <w:t>Two tools that make it “industry-like” are:</w:t>
+      </w:r>
+    </w:p>
+    <w:p>
+      <w:pPr>
+        <w:numPr>
+          <w:ilvl w:val="0"/>
+          <w:numId w:val="24"/>
+        </w:numPr>
+        <w:spacing w:before="100" w:beforeAutospacing="1" w:after="100" w:afterAutospacing="1" w:line="240" w:lineRule="auto"/>
+        <w:rPr>
+          <w:rFonts w:ascii="Times New Roman" w:eastAsia="Times New Roman" w:hAnsi="Times New Roman" w:cs="Times New Roman"/>
+          <w:kern w:val="0"/>
+          <w14:ligatures w14:val="none"/>
+        </w:rPr>
+      </w:pPr>
+      <w:r>
+        <w:rPr>
+          <w:rFonts w:ascii="Times New Roman" w:eastAsia="Times New Roman" w:hAnsi="Times New Roman" w:cs="Times New Roman"/>
+          <w:kern w:val="0"/>
+          <w14:ligatures w14:val="none"/>
+        </w:rPr>
+        <w:t>Apache Airflow → pipeline scheduler/orchestrator</w:t>
+      </w:r>
+    </w:p>
+    <w:p>
+      <w:pPr>
+        <w:numPr>
+          <w:ilvl w:val="0"/>
+          <w:numId w:val="24"/>
+        </w:numPr>
+        <w:spacing w:before="100" w:beforeAutospacing="1" w:after="100" w:afterAutospacing="1" w:line="240" w:lineRule="auto"/>
+        <w:rPr>
+          <w:rFonts w:ascii="Times New Roman" w:eastAsia="Times New Roman" w:hAnsi="Times New Roman" w:cs="Times New Roman"/>
+          <w:kern w:val="0"/>
+          <w14:ligatures w14:val="none"/>
+        </w:rPr>
+      </w:pPr>
+      <w:r>
+        <w:rPr>
+          <w:rFonts w:ascii="Times New Roman" w:eastAsia="Times New Roman" w:hAnsi="Times New Roman" w:cs="Times New Roman"/>
+          <w:kern w:val="0"/>
+          <w14:ligatures w14:val="none"/>
+        </w:rPr>
+        <w:t>PostgreSQL → production database</w:t>
+      </w:r>
+    </w:p>
+    <w:p>
+      <w:pPr>
+        <w:spacing w:before="100" w:beforeAutospacing="1" w:after="100" w:afterAutospacing="1" w:line="240" w:lineRule="auto"/>
+        <w:rPr>
+          <w:rFonts w:ascii="Times New Roman" w:eastAsia="Times New Roman" w:hAnsi="Times New Roman" w:cs="Times New Roman"/>
+          <w:kern w:val="0"/>
+          <w14:ligatures w14:val="none"/>
+        </w:rPr>
+      </w:pPr>
+      <w:r>
+        <w:rPr>
+          <w:rFonts w:ascii="Times New Roman" w:eastAsia="Times New Roman" w:hAnsi="Times New Roman" w:cs="Times New Roman"/>
+          <w:kern w:val="0"/>
+          <w14:ligatures w14:val="none"/>
+        </w:rPr>
+        <w:t xml:space="preserve">Let’s walk through how your </w:t>
+      </w:r>
+      <w:r>
+        <w:rPr>
+          <w:rFonts w:ascii="Times New Roman" w:eastAsia="Times New Roman" w:hAnsi="Times New Roman" w:cs="Times New Roman"/>
+          <w:b/>
+          <w:bCs/>
+          <w:kern w:val="0"/>
+          <w14:ligatures w14:val="none"/>
+        </w:rPr>
+        <w:t>crypto project evolves step by step</w:t>
+      </w:r>
+      <w:r>
+        <w:rPr>
+          <w:rFonts w:ascii="Times New Roman" w:eastAsia="Times New Roman" w:hAnsi="Times New Roman" w:cs="Times New Roman"/>
+          <w:kern w:val="0"/>
+          <w14:ligatures w14:val="none"/>
+        </w:rPr>
+        <w:t>.</w:t>
+      </w:r>
+    </w:p>
+    <w:p>
+      <w:pPr>
+        <w:spacing w:before="100" w:beforeAutospacing="1" w:after="100" w:afterAutospacing="1" w:line="240" w:lineRule="auto"/>
+        <w:rPr>
+          <w:rFonts w:ascii="Times New Roman" w:eastAsia="Times New Roman" w:hAnsi="Times New Roman" w:cs="Times New Roman"/>
+          <w:kern w:val="0"/>
+          <w14:ligatures w14:val="none"/>
+        </w:rPr>
+      </w:pPr>
+      <w:r>
+        <w:rPr>
+          <w:rFonts w:ascii="Times New Roman" w:eastAsia="Times New Roman" w:hAnsi="Times New Roman" w:cs="Times New Roman"/>
+          <w:kern w:val="0"/>
+          <w14:ligatures w14:val="none"/>
+        </w:rPr>
+        <w:pict w14:anchorId="4C8BE640">
+          <v:rect id="_x0000_i1046" style="width:0;height:1.5pt" o:hralign="center" o:hrstd="t" o:hr="t" fillcolor="#a0a0a0" stroked="f"/>
+        </w:pict>
+      </w:r>
+    </w:p>
+    <w:p>
+      <w:pPr>
+        <w:spacing w:before="100" w:beforeAutospacing="1" w:after="100" w:afterAutospacing="1" w:line="240" w:lineRule="auto"/>
+        <w:rPr>
+          <w:rFonts w:ascii="Times New Roman" w:eastAsia="Times New Roman" w:hAnsi="Times New Roman" w:cs="Times New Roman"/>
+          <w:b/>
+          <w:bCs/>
+          <w:kern w:val="0"/>
+          <w14:ligatures w14:val="none"/>
+        </w:rPr>
+      </w:pPr>
+      <w:r>
+        <w:rPr>
+          <w:rFonts w:ascii="Times New Roman" w:eastAsia="Times New Roman" w:hAnsi="Times New Roman" w:cs="Times New Roman"/>
+          <w:b/>
+          <w:bCs/>
+          <w:kern w:val="0"/>
+          <w14:ligatures w14:val="none"/>
+        </w:rPr>
+        <w:t>1️</w:t>
+      </w:r>
+      <w:r>
+        <w:rPr>
+          <w:rFonts w:ascii="Segoe UI Symbol" w:eastAsia="Times New Roman" w:hAnsi="Segoe UI Symbol" w:cs="Segoe UI Symbol"/>
+          <w:b/>
+          <w:bCs/>
+          <w:kern w:val="0"/>
+          <w14:ligatures w14:val="none"/>
+        </w:rPr>
+        <w:t>⃣</w:t>
+      </w:r>
+      <w:r>
+        <w:rPr>
+          <w:rFonts w:ascii="Times New Roman" w:eastAsia="Times New Roman" w:hAnsi="Times New Roman" w:cs="Times New Roman"/>
+          <w:b/>
+          <w:bCs/>
+          <w:kern w:val="0"/>
+          <w14:ligatures w14:val="none"/>
+        </w:rPr>
+        <w:t xml:space="preserve"> Current Version (Beginner Project)</w:t>
+      </w:r>
+    </w:p>
+    <w:p>
+      <w:pPr>
+        <w:spacing w:before="100" w:beforeAutospacing="1" w:after="100" w:afterAutospacing="1" w:line="240" w:lineRule="auto"/>
+        <w:rPr>
+          <w:rFonts w:ascii="Times New Roman" w:eastAsia="Times New Roman" w:hAnsi="Times New Roman" w:cs="Times New Roman"/>
+          <w:kern w:val="0"/>
+          <w14:ligatures w14:val="none"/>
+        </w:rPr>
+      </w:pPr>
+      <w:r>
+        <w:rPr>
+          <w:rFonts w:ascii="Times New Roman" w:eastAsia="Times New Roman" w:hAnsi="Times New Roman" w:cs="Times New Roman"/>
+          <w:kern w:val="0"/>
+          <w14:ligatures w14:val="none"/>
+        </w:rPr>
+        <w:t>Your current pipeline:</w:t>
+      </w:r>
+    </w:p>
+    <w:p>
+      <w:pPr>
+        <w:spacing w:before="100" w:beforeAutospacing="1" w:after="100" w:afterAutospacing="1" w:line="240" w:lineRule="auto"/>
+        <w:rPr>
+          <w:rFonts w:ascii="Times New Roman" w:eastAsia="Times New Roman" w:hAnsi="Times New Roman" w:cs="Times New Roman"/>
+          <w:kern w:val="0"/>
+          <w14:ligatures w14:val="none"/>
+        </w:rPr>
+      </w:pPr>
+      <w:proofErr w:type="spellStart"/>
+      <w:r>
+        <w:rPr>
+          <w:rFonts w:ascii="Times New Roman" w:eastAsia="Times New Roman" w:hAnsi="Times New Roman" w:cs="Times New Roman"/>
+          <w:kern w:val="0"/>
+          <w14:ligatures w14:val="none"/>
+        </w:rPr>
+        <w:t>CoinGecko</w:t>
+      </w:r>
+      <w:proofErr w:type="spellEnd"/>
+      <w:r>
+        <w:rPr>
+          <w:rFonts w:ascii="Times New Roman" w:eastAsia="Times New Roman" w:hAnsi="Times New Roman" w:cs="Times New Roman"/>
+          <w:kern w:val="0"/>
+          <w14:ligatures w14:val="none"/>
+        </w:rPr>
+        <w:t xml:space="preserve"> API → Python → CSV</w:t>
+      </w:r>
+    </w:p>
+    <w:p>
+      <w:pPr>
+        <w:spacing w:before="100" w:beforeAutospacing="1" w:after="100" w:afterAutospacing="1" w:line="240" w:lineRule="auto"/>
+        <w:rPr>
+          <w:rFonts w:ascii="Times New Roman" w:eastAsia="Times New Roman" w:hAnsi="Times New Roman" w:cs="Times New Roman"/>
+          <w:kern w:val="0"/>
+          <w14:ligatures w14:val="none"/>
+        </w:rPr>
+      </w:pPr>
+      <w:r>
+        <w:rPr>
+          <w:rFonts w:ascii="Times New Roman" w:eastAsia="Times New Roman" w:hAnsi="Times New Roman" w:cs="Times New Roman"/>
+          <w:kern w:val="0"/>
+          <w14:ligatures w14:val="none"/>
+        </w:rPr>
+        <w:t>Problems with this approach:</w:t>
+      </w:r>
+    </w:p>
+    <w:p>
+      <w:pPr>
+        <w:numPr>
+          <w:ilvl w:val="0"/>
+          <w:numId w:val="25"/>
+        </w:numPr>
+        <w:spacing w:before="100" w:beforeAutospacing="1" w:after="100" w:afterAutospacing="1" w:line="240" w:lineRule="auto"/>
+        <w:rPr>
+          <w:rFonts w:ascii="Times New Roman" w:eastAsia="Times New Roman" w:hAnsi="Times New Roman" w:cs="Times New Roman"/>
+          <w:kern w:val="0"/>
+          <w14:ligatures w14:val="none"/>
+        </w:rPr>
+      </w:pPr>
+      <w:r>
+        <w:rPr>
+          <w:rFonts w:ascii="Times New Roman" w:eastAsia="Times New Roman" w:hAnsi="Times New Roman" w:cs="Times New Roman"/>
+          <w:kern w:val="0"/>
+          <w14:ligatures w14:val="none"/>
+        </w:rPr>
+        <w:t>CSV is not scalable</w:t>
+      </w:r>
+    </w:p>
+    <w:p>
+      <w:pPr>
+        <w:numPr>
+          <w:ilvl w:val="0"/>
+          <w:numId w:val="25"/>
+        </w:numPr>
+        <w:spacing w:before="100" w:beforeAutospacing="1" w:after="100" w:afterAutospacing="1" w:line="240" w:lineRule="auto"/>
+        <w:rPr>
+          <w:rFonts w:ascii="Times New Roman" w:eastAsia="Times New Roman" w:hAnsi="Times New Roman" w:cs="Times New Roman"/>
+          <w:kern w:val="0"/>
+          <w14:ligatures w14:val="none"/>
+        </w:rPr>
+      </w:pPr>
+      <w:r>
+        <w:rPr>
+          <w:rFonts w:ascii="Times New Roman" w:eastAsia="Times New Roman" w:hAnsi="Times New Roman" w:cs="Times New Roman"/>
+          <w:kern w:val="0"/>
+          <w14:ligatures w14:val="none"/>
+        </w:rPr>
+        <w:t>no automation</w:t>
+      </w:r>
+    </w:p>
+    <w:p>
+      <w:pPr>
+        <w:numPr>
+          <w:ilvl w:val="0"/>
+          <w:numId w:val="25"/>
+        </w:numPr>
+        <w:spacing w:before="100" w:beforeAutospacing="1" w:after="100" w:afterAutospacing="1" w:line="240" w:lineRule="auto"/>
+        <w:rPr>
+          <w:rFonts w:ascii="Times New Roman" w:eastAsia="Times New Roman" w:hAnsi="Times New Roman" w:cs="Times New Roman"/>
+          <w:kern w:val="0"/>
+          <w14:ligatures w14:val="none"/>
+        </w:rPr>
+      </w:pPr>
+      <w:r>
+        <w:rPr>
+          <w:rFonts w:ascii="Times New Roman" w:eastAsia="Times New Roman" w:hAnsi="Times New Roman" w:cs="Times New Roman"/>
+          <w:kern w:val="0"/>
+          <w14:ligatures w14:val="none"/>
+        </w:rPr>
+        <w:t>no pipeline management</w:t>
+      </w:r>
+    </w:p>
+    <w:p>
+      <w:pPr>
+        <w:numPr>
+          <w:ilvl w:val="0"/>
+          <w:numId w:val="25"/>
+        </w:numPr>
+        <w:spacing w:before="100" w:beforeAutospacing="1" w:after="100" w:afterAutospacing="1" w:line="240" w:lineRule="auto"/>
+        <w:rPr>
+          <w:rFonts w:ascii="Times New Roman" w:eastAsia="Times New Roman" w:hAnsi="Times New Roman" w:cs="Times New Roman"/>
+          <w:kern w:val="0"/>
+          <w14:ligatures w14:val="none"/>
+        </w:rPr>
+      </w:pPr>
+      <w:r>
+        <w:rPr>
+          <w:rFonts w:ascii="Times New Roman" w:eastAsia="Times New Roman" w:hAnsi="Times New Roman" w:cs="Times New Roman"/>
+          <w:kern w:val="0"/>
+          <w14:ligatures w14:val="none"/>
+        </w:rPr>
+        <w:t>difficult to query data</w:t>
+      </w:r>
+    </w:p>
+    <w:p>
+      <w:pPr>
+        <w:spacing w:before="100" w:beforeAutospacing="1" w:after="100" w:afterAutospacing="1" w:line="240" w:lineRule="auto"/>
+        <w:rPr>
+          <w:rFonts w:ascii="Times New Roman" w:eastAsia="Times New Roman" w:hAnsi="Times New Roman" w:cs="Times New Roman"/>
+          <w:kern w:val="0"/>
+          <w14:ligatures w14:val="none"/>
+        </w:rPr>
+      </w:pPr>
+      <w:proofErr w:type="gramStart"/>
+      <w:r>
+        <w:rPr>
+          <w:rFonts w:ascii="Times New Roman" w:eastAsia="Times New Roman" w:hAnsi="Times New Roman" w:cs="Times New Roman"/>
+          <w:kern w:val="0"/>
+          <w14:ligatures w14:val="none"/>
+        </w:rPr>
+        <w:t>So</w:t>
+      </w:r>
+      <w:proofErr w:type="gramEnd"/>
+      <w:r>
+        <w:rPr>
+          <w:rFonts w:ascii="Times New Roman" w:eastAsia="Times New Roman" w:hAnsi="Times New Roman" w:cs="Times New Roman"/>
+          <w:kern w:val="0"/>
+          <w14:ligatures w14:val="none"/>
+        </w:rPr>
+        <w:t xml:space="preserve"> we upgrade it.</w:t>
+      </w:r>
+    </w:p>
+    <w:p>
+      <w:pPr>
+        <w:spacing w:before="100" w:beforeAutospacing="1" w:after="100" w:afterAutospacing="1" w:line="240" w:lineRule="auto"/>
+        <w:rPr>
+          <w:rFonts w:ascii="Times New Roman" w:eastAsia="Times New Roman" w:hAnsi="Times New Roman" w:cs="Times New Roman"/>
+          <w:kern w:val="0"/>
+          <w14:ligatures w14:val="none"/>
+        </w:rPr>
+      </w:pPr>
+      <w:r>
+        <w:rPr>
+          <w:rFonts w:ascii="Times New Roman" w:eastAsia="Times New Roman" w:hAnsi="Times New Roman" w:cs="Times New Roman"/>
+          <w:kern w:val="0"/>
+          <w14:ligatures w14:val="none"/>
+        </w:rPr>
+        <w:pict w14:anchorId="2E0CF281">
+          <v:rect id="_x0000_i1047" style="width:0;height:1.5pt" o:hralign="center" o:hrstd="t" o:hr="t" fillcolor="#a0a0a0" stroked="f"/>
+        </w:pict>
+      </w:r>
+    </w:p>
+    <w:p>
+      <w:pPr>
+        <w:spacing w:before="100" w:beforeAutospacing="1" w:after="100" w:afterAutospacing="1" w:line="240" w:lineRule="auto"/>
+        <w:rPr>
+          <w:rFonts w:ascii="Times New Roman" w:eastAsia="Times New Roman" w:hAnsi="Times New Roman" w:cs="Times New Roman"/>
+          <w:b/>
+          <w:bCs/>
+          <w:kern w:val="0"/>
+          <w14:ligatures w14:val="none"/>
+        </w:rPr>
+      </w:pPr>
+      <w:r>
+        <w:rPr>
+          <w:rFonts w:ascii="Times New Roman" w:eastAsia="Times New Roman" w:hAnsi="Times New Roman" w:cs="Times New Roman"/>
+          <w:b/>
+          <w:bCs/>
+          <w:kern w:val="0"/>
+          <w14:ligatures w14:val="none"/>
+        </w:rPr>
+        <w:t>2️</w:t>
+      </w:r>
+      <w:r>
+        <w:rPr>
+          <w:rFonts w:ascii="Segoe UI Symbol" w:eastAsia="Times New Roman" w:hAnsi="Segoe UI Symbol" w:cs="Segoe UI Symbol"/>
+          <w:b/>
+          <w:bCs/>
+          <w:kern w:val="0"/>
+          <w14:ligatures w14:val="none"/>
+        </w:rPr>
+        <w:t>⃣</w:t>
+      </w:r>
+      <w:r>
+        <w:rPr>
+          <w:rFonts w:ascii="Times New Roman" w:eastAsia="Times New Roman" w:hAnsi="Times New Roman" w:cs="Times New Roman"/>
+          <w:b/>
+          <w:bCs/>
+          <w:kern w:val="0"/>
+          <w14:ligatures w14:val="none"/>
+        </w:rPr>
+        <w:t xml:space="preserve"> Real Data Engineering Architecture</w:t>
+      </w:r>
+    </w:p>
+    <w:p>
+      <w:pPr>
+        <w:spacing w:before="100" w:beforeAutospacing="1" w:after="100" w:afterAutospacing="1" w:line="240" w:lineRule="auto"/>
+        <w:rPr>
+          <w:rFonts w:ascii="Times New Roman" w:eastAsia="Times New Roman" w:hAnsi="Times New Roman" w:cs="Times New Roman"/>
+          <w:kern w:val="0"/>
+          <w14:ligatures w14:val="none"/>
+        </w:rPr>
+      </w:pPr>
+      <w:r>
+        <w:rPr>
+          <w:rFonts w:ascii="Times New Roman" w:eastAsia="Times New Roman" w:hAnsi="Times New Roman" w:cs="Times New Roman"/>
+          <w:kern w:val="0"/>
+          <w14:ligatures w14:val="none"/>
+        </w:rPr>
+        <w:t>Final architecture should look like this:</w:t>
+      </w:r>
+    </w:p>
+    <w:p>
+      <w:pPr>
+        <w:spacing w:before="100" w:beforeAutospacing="1" w:after="100" w:afterAutospacing="1" w:line="240" w:lineRule="auto"/>
+        <w:rPr>
+          <w:rFonts w:ascii="Times New Roman" w:eastAsia="Times New Roman" w:hAnsi="Times New Roman" w:cs="Times New Roman"/>
+          <w:kern w:val="0"/>
+          <w14:ligatures w14:val="none"/>
+        </w:rPr>
+      </w:pPr>
+      <w:proofErr w:type="spellStart"/>
+      <w:r>
+        <w:rPr>
+          <w:rFonts w:ascii="Times New Roman" w:eastAsia="Times New Roman" w:hAnsi="Times New Roman" w:cs="Times New Roman"/>
+          <w:kern w:val="0"/>
+          <w14:ligatures w14:val="none"/>
+        </w:rPr>
+        <w:t>CoinGecko</w:t>
+      </w:r>
+      <w:proofErr w:type="spellEnd"/>
+      <w:r>
+        <w:rPr>
+          <w:rFonts w:ascii="Times New Roman" w:eastAsia="Times New Roman" w:hAnsi="Times New Roman" w:cs="Times New Roman"/>
+          <w:kern w:val="0"/>
+          <w14:ligatures w14:val="none"/>
+        </w:rPr>
+        <w:t xml:space="preserve"> API</w:t>
+      </w:r>
+      <w:r>
+        <w:rPr>
+          <w:rFonts w:ascii="Times New Roman" w:eastAsia="Times New Roman" w:hAnsi="Times New Roman" w:cs="Times New Roman"/>
+          <w:kern w:val="0"/>
+          <w14:ligatures w14:val="none"/>
+        </w:rPr>
+        <w:br/>
+        <w:t xml:space="preserve">      ↓</w:t>
+      </w:r>
+      <w:r>
+        <w:rPr>
+          <w:rFonts w:ascii="Times New Roman" w:eastAsia="Times New Roman" w:hAnsi="Times New Roman" w:cs="Times New Roman"/>
+          <w:kern w:val="0"/>
+          <w14:ligatures w14:val="none"/>
+        </w:rPr>
+        <w:br/>
+        <w:t>Extract Task</w:t>
+      </w:r>
+      <w:r>
+        <w:rPr>
+          <w:rFonts w:ascii="Times New Roman" w:eastAsia="Times New Roman" w:hAnsi="Times New Roman" w:cs="Times New Roman"/>
+          <w:kern w:val="0"/>
+          <w14:ligatures w14:val="none"/>
+        </w:rPr>
+        <w:br/>
+        <w:t xml:space="preserve">      ↓</w:t>
+      </w:r>
+      <w:r>
+        <w:rPr>
+          <w:rFonts w:ascii="Times New Roman" w:eastAsia="Times New Roman" w:hAnsi="Times New Roman" w:cs="Times New Roman"/>
+          <w:kern w:val="0"/>
+          <w14:ligatures w14:val="none"/>
+        </w:rPr>
+        <w:br/>
+        <w:t>Transform Task</w:t>
+      </w:r>
+      <w:r>
+        <w:rPr>
+          <w:rFonts w:ascii="Times New Roman" w:eastAsia="Times New Roman" w:hAnsi="Times New Roman" w:cs="Times New Roman"/>
+          <w:kern w:val="0"/>
+          <w14:ligatures w14:val="none"/>
+        </w:rPr>
+        <w:br/>
+        <w:t xml:space="preserve">      ↓</w:t>
+      </w:r>
+      <w:r>
+        <w:rPr>
+          <w:rFonts w:ascii="Times New Roman" w:eastAsia="Times New Roman" w:hAnsi="Times New Roman" w:cs="Times New Roman"/>
+          <w:kern w:val="0"/>
+          <w14:ligatures w14:val="none"/>
+        </w:rPr>
+        <w:br/>
+        <w:t>Load Task</w:t>
+      </w:r>
+      <w:r>
+        <w:rPr>
+          <w:rFonts w:ascii="Times New Roman" w:eastAsia="Times New Roman" w:hAnsi="Times New Roman" w:cs="Times New Roman"/>
+          <w:kern w:val="0"/>
+          <w14:ligatures w14:val="none"/>
+        </w:rPr>
+        <w:br/>
+        <w:t xml:space="preserve">      ↓</w:t>
+      </w:r>
+      <w:r>
+        <w:rPr>
+          <w:rFonts w:ascii="Times New Roman" w:eastAsia="Times New Roman" w:hAnsi="Times New Roman" w:cs="Times New Roman"/>
+          <w:kern w:val="0"/>
+          <w14:ligatures w14:val="none"/>
+        </w:rPr>
+        <w:br/>
+      </w:r>
+      <w:r>
+        <w:rPr>
+          <w:rFonts w:ascii="Times New Roman" w:eastAsia="Times New Roman" w:hAnsi="Times New Roman" w:cs="Times New Roman"/>
+          <w:kern w:val="0"/>
+          <w14:ligatures w14:val="none"/>
+        </w:rPr>
+        <w:lastRenderedPageBreak/>
+        <w:t>PostgreSQL Database</w:t>
+      </w:r>
+      <w:r>
+        <w:rPr>
+          <w:rFonts w:ascii="Times New Roman" w:eastAsia="Times New Roman" w:hAnsi="Times New Roman" w:cs="Times New Roman"/>
+          <w:kern w:val="0"/>
+          <w14:ligatures w14:val="none"/>
+        </w:rPr>
+        <w:br/>
+        <w:t xml:space="preserve">      ↓</w:t>
+      </w:r>
+      <w:r>
+        <w:rPr>
+          <w:rFonts w:ascii="Times New Roman" w:eastAsia="Times New Roman" w:hAnsi="Times New Roman" w:cs="Times New Roman"/>
+          <w:kern w:val="0"/>
+          <w14:ligatures w14:val="none"/>
+        </w:rPr>
+        <w:br/>
+        <w:t>Dashboard / Analysis</w:t>
+      </w:r>
+    </w:p>
+    <w:p>
+      <w:pPr>
+        <w:spacing w:before="100" w:beforeAutospacing="1" w:after="100" w:afterAutospacing="1" w:line="240" w:lineRule="auto"/>
+        <w:rPr>
+          <w:rFonts w:ascii="Times New Roman" w:eastAsia="Times New Roman" w:hAnsi="Times New Roman" w:cs="Times New Roman"/>
+          <w:kern w:val="0"/>
+          <w14:ligatures w14:val="none"/>
+        </w:rPr>
+      </w:pPr>
+      <w:r>
+        <w:rPr>
+          <w:rFonts w:ascii="Times New Roman" w:eastAsia="Times New Roman" w:hAnsi="Times New Roman" w:cs="Times New Roman"/>
+          <w:kern w:val="0"/>
+          <w14:ligatures w14:val="none"/>
+        </w:rPr>
+        <w:t xml:space="preserve">And the </w:t>
+      </w:r>
+      <w:r>
+        <w:rPr>
+          <w:rFonts w:ascii="Times New Roman" w:eastAsia="Times New Roman" w:hAnsi="Times New Roman" w:cs="Times New Roman"/>
+          <w:b/>
+          <w:bCs/>
+          <w:kern w:val="0"/>
+          <w14:ligatures w14:val="none"/>
+        </w:rPr>
+        <w:t>scheduler controlling the pipeline</w:t>
+      </w:r>
+      <w:r>
+        <w:rPr>
+          <w:rFonts w:ascii="Times New Roman" w:eastAsia="Times New Roman" w:hAnsi="Times New Roman" w:cs="Times New Roman"/>
+          <w:kern w:val="0"/>
+          <w14:ligatures w14:val="none"/>
+        </w:rPr>
+        <w:t xml:space="preserve"> is:</w:t>
+      </w:r>
+    </w:p>
+    <w:p>
+      <w:pPr>
+        <w:spacing w:before="100" w:beforeAutospacing="1" w:after="100" w:afterAutospacing="1" w:line="240" w:lineRule="auto"/>
+        <w:rPr>
+          <w:rFonts w:ascii="Times New Roman" w:eastAsia="Times New Roman" w:hAnsi="Times New Roman" w:cs="Times New Roman"/>
+          <w:kern w:val="0"/>
+          <w14:ligatures w14:val="none"/>
+        </w:rPr>
+      </w:pPr>
+      <w:r>
+        <w:rPr>
+          <w:rFonts w:ascii="Times New Roman" w:eastAsia="Times New Roman" w:hAnsi="Times New Roman" w:cs="Times New Roman"/>
+          <w:kern w:val="0"/>
+          <w14:ligatures w14:val="none"/>
+        </w:rPr>
+        <w:t>Apache Airflow</w:t>
+      </w:r>
+    </w:p>
+    <w:p>
+      <w:pPr>
+        <w:spacing w:before="100" w:beforeAutospacing="1" w:after="100" w:afterAutospacing="1" w:line="240" w:lineRule="auto"/>
+        <w:rPr>
+          <w:rFonts w:ascii="Times New Roman" w:eastAsia="Times New Roman" w:hAnsi="Times New Roman" w:cs="Times New Roman"/>
+          <w:kern w:val="0"/>
+          <w14:ligatures w14:val="none"/>
+        </w:rPr>
+      </w:pPr>
+      <w:r>
+        <w:rPr>
+          <w:rFonts w:ascii="Times New Roman" w:eastAsia="Times New Roman" w:hAnsi="Times New Roman" w:cs="Times New Roman"/>
+          <w:kern w:val="0"/>
+          <w14:ligatures w14:val="none"/>
+        </w:rPr>
+        <w:t>So full architecture:</w:t>
+      </w:r>
+    </w:p>
+    <w:p>
+      <w:pPr>
+        <w:spacing w:before="100" w:beforeAutospacing="1" w:after="100" w:afterAutospacing="1" w:line="240" w:lineRule="auto"/>
+        <w:rPr>
+          <w:rFonts w:ascii="Times New Roman" w:eastAsia="Times New Roman" w:hAnsi="Times New Roman" w:cs="Times New Roman"/>
+          <w:kern w:val="0"/>
+          <w14:ligatures w14:val="none"/>
+        </w:rPr>
+      </w:pPr>
+      <w:r>
+        <w:rPr>
+          <w:rFonts w:ascii="Times New Roman" w:eastAsia="Times New Roman" w:hAnsi="Times New Roman" w:cs="Times New Roman"/>
+          <w:kern w:val="0"/>
+          <w14:ligatures w14:val="none"/>
+        </w:rPr>
+        <w:t>Airflow DAG</w:t>
+      </w:r>
+      <w:r>
+        <w:rPr>
+          <w:rFonts w:ascii="Times New Roman" w:eastAsia="Times New Roman" w:hAnsi="Times New Roman" w:cs="Times New Roman"/>
+          <w:kern w:val="0"/>
+          <w14:ligatures w14:val="none"/>
+        </w:rPr>
+        <w:br/>
+        <w:t xml:space="preserve">   ├── Extract Crypto API</w:t>
+      </w:r>
+      <w:r>
+        <w:rPr>
+          <w:rFonts w:ascii="Times New Roman" w:eastAsia="Times New Roman" w:hAnsi="Times New Roman" w:cs="Times New Roman"/>
+          <w:kern w:val="0"/>
+          <w14:ligatures w14:val="none"/>
+        </w:rPr>
+        <w:br/>
+        <w:t xml:space="preserve">   ├── Transform Data</w:t>
+      </w:r>
+      <w:r>
+        <w:rPr>
+          <w:rFonts w:ascii="Times New Roman" w:eastAsia="Times New Roman" w:hAnsi="Times New Roman" w:cs="Times New Roman"/>
+          <w:kern w:val="0"/>
+          <w14:ligatures w14:val="none"/>
+        </w:rPr>
+        <w:br/>
+        <w:t xml:space="preserve">   └── Load to PostgreSQL</w:t>
+      </w:r>
+    </w:p>
+    <w:p>
+      <w:pPr>
+        <w:spacing w:before="100" w:beforeAutospacing="1" w:after="100" w:afterAutospacing="1" w:line="240" w:lineRule="auto"/>
+        <w:rPr>
+          <w:rFonts w:ascii="Times New Roman" w:eastAsia="Times New Roman" w:hAnsi="Times New Roman" w:cs="Times New Roman"/>
+          <w:kern w:val="0"/>
+          <w14:ligatures w14:val="none"/>
+        </w:rPr>
+      </w:pPr>
+      <w:r>
+        <w:rPr>
+          <w:rFonts w:ascii="Times New Roman" w:eastAsia="Times New Roman" w:hAnsi="Times New Roman" w:cs="Times New Roman"/>
+          <w:kern w:val="0"/>
+          <w14:ligatures w14:val="none"/>
+        </w:rPr>
+        <w:t>This is exactly how real data teams build pipelines.</w:t>
+      </w:r>
+    </w:p>
+    <w:p>
+      <w:pPr>
+        <w:spacing w:before="100" w:beforeAutospacing="1" w:after="100" w:afterAutospacing="1" w:line="240" w:lineRule="auto"/>
+        <w:rPr>
+          <w:rFonts w:ascii="Times New Roman" w:eastAsia="Times New Roman" w:hAnsi="Times New Roman" w:cs="Times New Roman"/>
+          <w:kern w:val="0"/>
+          <w14:ligatures w14:val="none"/>
+        </w:rPr>
+      </w:pPr>
+      <w:r>
+        <w:rPr>
+          <w:rFonts w:ascii="Times New Roman" w:eastAsia="Times New Roman" w:hAnsi="Times New Roman" w:cs="Times New Roman"/>
+          <w:kern w:val="0"/>
+          <w14:ligatures w14:val="none"/>
+        </w:rPr>
+        <w:pict w14:anchorId="41BFFCC1">
+          <v:rect id="_x0000_i1048" style="width:0;height:1.5pt" o:hralign="center" o:hrstd="t" o:hr="t" fillcolor="#a0a0a0" stroked="f"/>
+        </w:pict>
+      </w:r>
+    </w:p>
+    <w:p>
+      <w:pPr>
+        <w:spacing w:before="100" w:beforeAutospacing="1" w:after="100" w:afterAutospacing="1" w:line="240" w:lineRule="auto"/>
+        <w:rPr>
+          <w:rFonts w:ascii="Times New Roman" w:eastAsia="Times New Roman" w:hAnsi="Times New Roman" w:cs="Times New Roman"/>
+          <w:b/>
+          <w:bCs/>
+          <w:kern w:val="0"/>
+          <w14:ligatures w14:val="none"/>
+        </w:rPr>
+      </w:pPr>
+      <w:r>
+        <w:rPr>
+          <w:rFonts w:ascii="Times New Roman" w:eastAsia="Times New Roman" w:hAnsi="Times New Roman" w:cs="Times New Roman"/>
+          <w:b/>
+          <w:bCs/>
+          <w:kern w:val="0"/>
+          <w14:ligatures w14:val="none"/>
+        </w:rPr>
+        <w:t>3️</w:t>
+      </w:r>
+      <w:r>
+        <w:rPr>
+          <w:rFonts w:ascii="Segoe UI Symbol" w:eastAsia="Times New Roman" w:hAnsi="Segoe UI Symbol" w:cs="Segoe UI Symbol"/>
+          <w:b/>
+          <w:bCs/>
+          <w:kern w:val="0"/>
+          <w14:ligatures w14:val="none"/>
+        </w:rPr>
+        <w:t>⃣</w:t>
+      </w:r>
+      <w:r>
+        <w:rPr>
+          <w:rFonts w:ascii="Times New Roman" w:eastAsia="Times New Roman" w:hAnsi="Times New Roman" w:cs="Times New Roman"/>
+          <w:b/>
+          <w:bCs/>
+          <w:kern w:val="0"/>
+          <w14:ligatures w14:val="none"/>
+        </w:rPr>
+        <w:t xml:space="preserve"> Upgrade 1 — Store Data in PostgreSQL</w:t>
+      </w:r>
+    </w:p>
+    <w:p>
+      <w:pPr>
+        <w:spacing w:before="100" w:beforeAutospacing="1" w:after="100" w:afterAutospacing="1" w:line="240" w:lineRule="auto"/>
+        <w:rPr>
+          <w:rFonts w:ascii="Times New Roman" w:eastAsia="Times New Roman" w:hAnsi="Times New Roman" w:cs="Times New Roman"/>
+          <w:kern w:val="0"/>
+          <w14:ligatures w14:val="none"/>
+        </w:rPr>
+      </w:pPr>
+      <w:r>
+        <w:rPr>
+          <w:rFonts w:ascii="Times New Roman" w:eastAsia="Times New Roman" w:hAnsi="Times New Roman" w:cs="Times New Roman"/>
+          <w:kern w:val="0"/>
+          <w14:ligatures w14:val="none"/>
+        </w:rPr>
+        <w:t>Instead of CSV:</w:t>
+      </w:r>
+    </w:p>
+    <w:p>
+      <w:pPr>
+        <w:spacing w:before="100" w:beforeAutospacing="1" w:after="100" w:afterAutospacing="1" w:line="240" w:lineRule="auto"/>
+        <w:rPr>
+          <w:rFonts w:ascii="Times New Roman" w:eastAsia="Times New Roman" w:hAnsi="Times New Roman" w:cs="Times New Roman"/>
+          <w:kern w:val="0"/>
+          <w14:ligatures w14:val="none"/>
+        </w:rPr>
+      </w:pPr>
+      <w:r>
+        <w:rPr>
+          <w:rFonts w:ascii="Times New Roman" w:eastAsia="Times New Roman" w:hAnsi="Times New Roman" w:cs="Times New Roman"/>
+          <w:kern w:val="0"/>
+          <w14:ligatures w14:val="none"/>
+        </w:rPr>
+        <w:t>crypto_prices.csv</w:t>
+      </w:r>
+    </w:p>
+    <w:p>
+      <w:pPr>
+        <w:spacing w:before="100" w:beforeAutospacing="1" w:after="100" w:afterAutospacing="1" w:line="240" w:lineRule="auto"/>
+        <w:rPr>
+          <w:rFonts w:ascii="Times New Roman" w:eastAsia="Times New Roman" w:hAnsi="Times New Roman" w:cs="Times New Roman"/>
+          <w:kern w:val="0"/>
+          <w14:ligatures w14:val="none"/>
+        </w:rPr>
+      </w:pPr>
+      <w:r>
+        <w:rPr>
+          <w:rFonts w:ascii="Times New Roman" w:eastAsia="Times New Roman" w:hAnsi="Times New Roman" w:cs="Times New Roman"/>
+          <w:kern w:val="0"/>
+          <w14:ligatures w14:val="none"/>
+        </w:rPr>
+        <w:t xml:space="preserve">We store data in a </w:t>
+      </w:r>
+      <w:r>
+        <w:rPr>
+          <w:rFonts w:ascii="Times New Roman" w:eastAsia="Times New Roman" w:hAnsi="Times New Roman" w:cs="Times New Roman"/>
+          <w:b/>
+          <w:bCs/>
+          <w:kern w:val="0"/>
+          <w14:ligatures w14:val="none"/>
+        </w:rPr>
+        <w:t>database table</w:t>
+      </w:r>
+      <w:r>
+        <w:rPr>
+          <w:rFonts w:ascii="Times New Roman" w:eastAsia="Times New Roman" w:hAnsi="Times New Roman" w:cs="Times New Roman"/>
+          <w:kern w:val="0"/>
+          <w14:ligatures w14:val="none"/>
+        </w:rPr>
+        <w:t>.</w:t>
+      </w:r>
+    </w:p>
+    <w:p>
+      <w:pPr>
+        <w:spacing w:before="100" w:beforeAutospacing="1" w:after="100" w:afterAutospacing="1" w:line="240" w:lineRule="auto"/>
+        <w:rPr>
+          <w:rFonts w:ascii="Times New Roman" w:eastAsia="Times New Roman" w:hAnsi="Times New Roman" w:cs="Times New Roman"/>
+          <w:kern w:val="0"/>
+          <w14:ligatures w14:val="none"/>
+        </w:rPr>
+      </w:pPr>
+      <w:r>
+        <w:rPr>
+          <w:rFonts w:ascii="Times New Roman" w:eastAsia="Times New Roman" w:hAnsi="Times New Roman" w:cs="Times New Roman"/>
+          <w:kern w:val="0"/>
+          <w14:ligatures w14:val="none"/>
+        </w:rPr>
+        <w:t>Example table:</w:t>
+      </w:r>
+    </w:p>
+    <w:p>
+      <w:pPr>
+        <w:spacing w:before="100" w:beforeAutospacing="1" w:after="100" w:afterAutospacing="1" w:line="240" w:lineRule="auto"/>
+        <w:rPr>
+          <w:rFonts w:ascii="Times New Roman" w:eastAsia="Times New Roman" w:hAnsi="Times New Roman" w:cs="Times New Roman"/>
+          <w:kern w:val="0"/>
+          <w14:ligatures w14:val="none"/>
+        </w:rPr>
+      </w:pPr>
+      <w:proofErr w:type="spellStart"/>
+      <w:r>
+        <w:rPr>
+          <w:rFonts w:ascii="Times New Roman" w:eastAsia="Times New Roman" w:hAnsi="Times New Roman" w:cs="Times New Roman"/>
+          <w:kern w:val="0"/>
+          <w14:ligatures w14:val="none"/>
+        </w:rPr>
+        <w:t>crypto_prices</w:t>
+      </w:r>
+      <w:proofErr w:type="spellEnd"/>
+      <w:r>
+        <w:rPr>
+          <w:rFonts w:ascii="Times New Roman" w:eastAsia="Times New Roman" w:hAnsi="Times New Roman" w:cs="Times New Roman"/>
+          <w:kern w:val="0"/>
+          <w14:ligatures w14:val="none"/>
+        </w:rPr>
+        <w:br/>
+        <w:t>------------------------</w:t>
+      </w:r>
+      <w:r>
+        <w:rPr>
+          <w:rFonts w:ascii="Times New Roman" w:eastAsia="Times New Roman" w:hAnsi="Times New Roman" w:cs="Times New Roman"/>
+          <w:kern w:val="0"/>
+          <w14:ligatures w14:val="none"/>
+        </w:rPr>
+        <w:br/>
+        <w:t>timestamp</w:t>
+      </w:r>
+      <w:r>
+        <w:rPr>
+          <w:rFonts w:ascii="Times New Roman" w:eastAsia="Times New Roman" w:hAnsi="Times New Roman" w:cs="Times New Roman"/>
+          <w:kern w:val="0"/>
+          <w14:ligatures w14:val="none"/>
+        </w:rPr>
+        <w:br/>
+      </w:r>
+      <w:proofErr w:type="spellStart"/>
+      <w:r>
+        <w:rPr>
+          <w:rFonts w:ascii="Times New Roman" w:eastAsia="Times New Roman" w:hAnsi="Times New Roman" w:cs="Times New Roman"/>
+          <w:kern w:val="0"/>
+          <w14:ligatures w14:val="none"/>
+        </w:rPr>
+        <w:t>bitcoin_price</w:t>
+      </w:r>
+      <w:proofErr w:type="spellEnd"/>
+      <w:r>
+        <w:rPr>
+          <w:rFonts w:ascii="Times New Roman" w:eastAsia="Times New Roman" w:hAnsi="Times New Roman" w:cs="Times New Roman"/>
+          <w:kern w:val="0"/>
+          <w14:ligatures w14:val="none"/>
+        </w:rPr>
+        <w:br/>
+      </w:r>
+      <w:proofErr w:type="spellStart"/>
+      <w:r>
+        <w:rPr>
+          <w:rFonts w:ascii="Times New Roman" w:eastAsia="Times New Roman" w:hAnsi="Times New Roman" w:cs="Times New Roman"/>
+          <w:kern w:val="0"/>
+          <w14:ligatures w14:val="none"/>
+        </w:rPr>
+        <w:t>ethereum_price</w:t>
+      </w:r>
+      <w:proofErr w:type="spellEnd"/>
+    </w:p>
+    <w:p>
+      <w:pPr>
+        <w:spacing w:before="100" w:beforeAutospacing="1" w:after="100" w:afterAutospacing="1" w:line="240" w:lineRule="auto"/>
+        <w:rPr>
+          <w:rFonts w:ascii="Times New Roman" w:eastAsia="Times New Roman" w:hAnsi="Times New Roman" w:cs="Times New Roman"/>
+          <w:kern w:val="0"/>
+          <w14:ligatures w14:val="none"/>
+        </w:rPr>
+      </w:pPr>
+      <w:r>
+        <w:rPr>
+          <w:rFonts w:ascii="Times New Roman" w:eastAsia="Times New Roman" w:hAnsi="Times New Roman" w:cs="Times New Roman"/>
+          <w:kern w:val="0"/>
+          <w14:ligatures w14:val="none"/>
+        </w:rPr>
+        <w:t xml:space="preserve">Now your data is </w:t>
+      </w:r>
+      <w:r>
+        <w:rPr>
+          <w:rFonts w:ascii="Times New Roman" w:eastAsia="Times New Roman" w:hAnsi="Times New Roman" w:cs="Times New Roman"/>
+          <w:b/>
+          <w:bCs/>
+          <w:kern w:val="0"/>
+          <w14:ligatures w14:val="none"/>
+        </w:rPr>
+        <w:t>stored like a real production system</w:t>
+      </w:r>
+      <w:r>
+        <w:rPr>
+          <w:rFonts w:ascii="Times New Roman" w:eastAsia="Times New Roman" w:hAnsi="Times New Roman" w:cs="Times New Roman"/>
+          <w:kern w:val="0"/>
+          <w14:ligatures w14:val="none"/>
+        </w:rPr>
+        <w:t>.</w:t>
+      </w:r>
+    </w:p>
+    <w:p>
+      <w:pPr>
+        <w:spacing w:before="100" w:beforeAutospacing="1" w:after="100" w:afterAutospacing="1" w:line="240" w:lineRule="auto"/>
+        <w:rPr>
+          <w:rFonts w:ascii="Times New Roman" w:eastAsia="Times New Roman" w:hAnsi="Times New Roman" w:cs="Times New Roman"/>
+          <w:kern w:val="0"/>
+          <w14:ligatures w14:val="none"/>
+        </w:rPr>
+      </w:pPr>
+      <w:r>
+        <w:rPr>
+          <w:rFonts w:ascii="Times New Roman" w:eastAsia="Times New Roman" w:hAnsi="Times New Roman" w:cs="Times New Roman"/>
+          <w:kern w:val="0"/>
+          <w14:ligatures w14:val="none"/>
+        </w:rPr>
+        <w:pict w14:anchorId="566D116C">
+          <v:rect id="_x0000_i1058" style="width:0;height:1.5pt" o:hralign="center" o:hrstd="t" o:hr="t" fillcolor="#a0a0a0" stroked="f"/>
+        </w:pict>
+      </w:r>
+    </w:p>
+    <w:p>
+      <w:pPr>
+        <w:spacing w:before="100" w:beforeAutospacing="1" w:after="100" w:afterAutospacing="1" w:line="240" w:lineRule="auto"/>
+        <w:rPr>
+          <w:rFonts w:ascii="Times New Roman" w:eastAsia="Times New Roman" w:hAnsi="Times New Roman" w:cs="Times New Roman"/>
+          <w:b/>
+          <w:bCs/>
+          <w:kern w:val="0"/>
+          <w14:ligatures w14:val="none"/>
+        </w:rPr>
+      </w:pPr>
+      <w:r>
+        <w:rPr>
+          <w:rFonts w:ascii="Times New Roman" w:eastAsia="Times New Roman" w:hAnsi="Times New Roman" w:cs="Times New Roman"/>
+          <w:b/>
+          <w:bCs/>
+          <w:kern w:val="0"/>
+          <w14:ligatures w14:val="none"/>
+        </w:rPr>
+        <w:t>4️</w:t>
+      </w:r>
+      <w:r>
+        <w:rPr>
+          <w:rFonts w:ascii="Segoe UI Symbol" w:eastAsia="Times New Roman" w:hAnsi="Segoe UI Symbol" w:cs="Segoe UI Symbol"/>
+          <w:b/>
+          <w:bCs/>
+          <w:kern w:val="0"/>
+          <w14:ligatures w14:val="none"/>
+        </w:rPr>
+        <w:t>⃣</w:t>
+      </w:r>
+      <w:r>
+        <w:rPr>
+          <w:rFonts w:ascii="Times New Roman" w:eastAsia="Times New Roman" w:hAnsi="Times New Roman" w:cs="Times New Roman"/>
+          <w:b/>
+          <w:bCs/>
+          <w:kern w:val="0"/>
+          <w14:ligatures w14:val="none"/>
+        </w:rPr>
+        <w:t xml:space="preserve"> Upgrade 2 — Introduce Airflow</w:t>
+      </w:r>
+    </w:p>
+    <w:p>
+      <w:pPr>
+        <w:spacing w:before="100" w:beforeAutospacing="1" w:after="100" w:afterAutospacing="1" w:line="240" w:lineRule="auto"/>
+        <w:rPr>
+          <w:rFonts w:ascii="Times New Roman" w:eastAsia="Times New Roman" w:hAnsi="Times New Roman" w:cs="Times New Roman"/>
+          <w:kern w:val="0"/>
+          <w14:ligatures w14:val="none"/>
+        </w:rPr>
+      </w:pPr>
+      <w:r>
+        <w:rPr>
+          <w:rFonts w:ascii="Times New Roman" w:eastAsia="Times New Roman" w:hAnsi="Times New Roman" w:cs="Times New Roman"/>
+          <w:kern w:val="0"/>
+          <w14:ligatures w14:val="none"/>
+        </w:rPr>
+        <w:t>Instead of running scripts manually:</w:t>
+      </w:r>
+    </w:p>
+    <w:p>
+      <w:pPr>
+        <w:spacing w:before="100" w:beforeAutospacing="1" w:after="100" w:afterAutospacing="1" w:line="240" w:lineRule="auto"/>
+        <w:rPr>
+          <w:rFonts w:ascii="Times New Roman" w:eastAsia="Times New Roman" w:hAnsi="Times New Roman" w:cs="Times New Roman"/>
+          <w:kern w:val="0"/>
+          <w14:ligatures w14:val="none"/>
+        </w:rPr>
+      </w:pPr>
+      <w:r>
+        <w:rPr>
+          <w:rFonts w:ascii="Times New Roman" w:eastAsia="Times New Roman" w:hAnsi="Times New Roman" w:cs="Times New Roman"/>
+          <w:kern w:val="0"/>
+          <w14:ligatures w14:val="none"/>
+        </w:rPr>
+        <w:t>python crypto_pipeline.py</w:t>
+      </w:r>
+    </w:p>
+    <w:p>
+      <w:pPr>
+        <w:spacing w:before="100" w:beforeAutospacing="1" w:after="100" w:afterAutospacing="1" w:line="240" w:lineRule="auto"/>
+        <w:rPr>
+          <w:rFonts w:ascii="Times New Roman" w:eastAsia="Times New Roman" w:hAnsi="Times New Roman" w:cs="Times New Roman"/>
+          <w:kern w:val="0"/>
+          <w14:ligatures w14:val="none"/>
+        </w:rPr>
+      </w:pPr>
+      <w:r>
+        <w:rPr>
+          <w:rFonts w:ascii="Times New Roman" w:eastAsia="Times New Roman" w:hAnsi="Times New Roman" w:cs="Times New Roman"/>
+          <w:kern w:val="0"/>
+          <w14:ligatures w14:val="none"/>
+        </w:rPr>
+        <w:t xml:space="preserve">We let </w:t>
+      </w:r>
+      <w:r>
+        <w:rPr>
+          <w:rFonts w:ascii="Times New Roman" w:eastAsia="Times New Roman" w:hAnsi="Times New Roman" w:cs="Times New Roman"/>
+          <w:b/>
+          <w:bCs/>
+          <w:kern w:val="0"/>
+          <w14:ligatures w14:val="none"/>
+        </w:rPr>
+        <w:t>Airflow schedule it daily</w:t>
+      </w:r>
+      <w:r>
+        <w:rPr>
+          <w:rFonts w:ascii="Times New Roman" w:eastAsia="Times New Roman" w:hAnsi="Times New Roman" w:cs="Times New Roman"/>
+          <w:kern w:val="0"/>
+          <w14:ligatures w14:val="none"/>
+        </w:rPr>
+        <w:t>.</w:t>
+      </w:r>
+    </w:p>
+    <w:p>
+      <w:pPr>
+        <w:spacing w:before="100" w:beforeAutospacing="1" w:after="100" w:afterAutospacing="1" w:line="240" w:lineRule="auto"/>
+        <w:rPr>
+          <w:rFonts w:ascii="Times New Roman" w:eastAsia="Times New Roman" w:hAnsi="Times New Roman" w:cs="Times New Roman"/>
+          <w:kern w:val="0"/>
+          <w14:ligatures w14:val="none"/>
+        </w:rPr>
+      </w:pPr>
+      <w:r>
+        <w:rPr>
+          <w:rFonts w:ascii="Times New Roman" w:eastAsia="Times New Roman" w:hAnsi="Times New Roman" w:cs="Times New Roman"/>
+          <w:kern w:val="0"/>
+          <w14:ligatures w14:val="none"/>
+        </w:rPr>
+        <w:t>Example schedule:</w:t>
+      </w:r>
+    </w:p>
+    <w:p>
+      <w:pPr>
+        <w:spacing w:before="100" w:beforeAutospacing="1" w:after="100" w:afterAutospacing="1" w:line="240" w:lineRule="auto"/>
+        <w:rPr>
+          <w:rFonts w:ascii="Times New Roman" w:eastAsia="Times New Roman" w:hAnsi="Times New Roman" w:cs="Times New Roman"/>
+          <w:kern w:val="0"/>
+          <w14:ligatures w14:val="none"/>
+        </w:rPr>
+      </w:pPr>
+      <w:r>
+        <w:rPr>
+          <w:rFonts w:ascii="Times New Roman" w:eastAsia="Times New Roman" w:hAnsi="Times New Roman" w:cs="Times New Roman"/>
+          <w:kern w:val="0"/>
+          <w14:ligatures w14:val="none"/>
+        </w:rPr>
+        <w:lastRenderedPageBreak/>
+        <w:t>Run pipeline every day at 9 AM</w:t>
+      </w:r>
+    </w:p>
+    <w:p>
+      <w:pPr>
+        <w:spacing w:before="100" w:beforeAutospacing="1" w:after="100" w:afterAutospacing="1" w:line="240" w:lineRule="auto"/>
+        <w:rPr>
+          <w:rFonts w:ascii="Times New Roman" w:eastAsia="Times New Roman" w:hAnsi="Times New Roman" w:cs="Times New Roman"/>
+          <w:kern w:val="0"/>
+          <w14:ligatures w14:val="none"/>
+        </w:rPr>
+      </w:pPr>
+      <w:r>
+        <w:rPr>
+          <w:rFonts w:ascii="Times New Roman" w:eastAsia="Times New Roman" w:hAnsi="Times New Roman" w:cs="Times New Roman"/>
+          <w:kern w:val="0"/>
+          <w14:ligatures w14:val="none"/>
+        </w:rPr>
+        <w:t xml:space="preserve">In Airflow, pipelines are called </w:t>
+      </w:r>
+      <w:r>
+        <w:rPr>
+          <w:rFonts w:ascii="Times New Roman" w:eastAsia="Times New Roman" w:hAnsi="Times New Roman" w:cs="Times New Roman"/>
+          <w:b/>
+          <w:bCs/>
+          <w:kern w:val="0"/>
+          <w14:ligatures w14:val="none"/>
+        </w:rPr>
+        <w:t>DAGs (Directed Acyclic Graphs)</w:t>
+      </w:r>
+      <w:r>
+        <w:rPr>
+          <w:rFonts w:ascii="Times New Roman" w:eastAsia="Times New Roman" w:hAnsi="Times New Roman" w:cs="Times New Roman"/>
+          <w:kern w:val="0"/>
+          <w14:ligatures w14:val="none"/>
+        </w:rPr>
+        <w:t>.</w:t>
+      </w:r>
+    </w:p>
+    <w:p>
+      <w:pPr>
+        <w:spacing w:before="100" w:beforeAutospacing="1" w:after="100" w:afterAutospacing="1" w:line="240" w:lineRule="auto"/>
+        <w:rPr>
+          <w:rFonts w:ascii="Times New Roman" w:eastAsia="Times New Roman" w:hAnsi="Times New Roman" w:cs="Times New Roman"/>
+          <w:kern w:val="0"/>
+          <w14:ligatures w14:val="none"/>
+        </w:rPr>
+      </w:pPr>
+      <w:r>
+        <w:rPr>
+          <w:rFonts w:ascii="Times New Roman" w:eastAsia="Times New Roman" w:hAnsi="Times New Roman" w:cs="Times New Roman"/>
+          <w:kern w:val="0"/>
+          <w14:ligatures w14:val="none"/>
+        </w:rPr>
+        <w:t>Example DAG structure:</w:t>
+      </w:r>
+    </w:p>
+    <w:p>
+      <w:pPr>
+        <w:spacing w:before="100" w:beforeAutospacing="1" w:after="100" w:afterAutospacing="1" w:line="240" w:lineRule="auto"/>
+        <w:rPr>
+          <w:rFonts w:ascii="Times New Roman" w:eastAsia="Times New Roman" w:hAnsi="Times New Roman" w:cs="Times New Roman"/>
+          <w:kern w:val="0"/>
+          <w14:ligatures w14:val="none"/>
+        </w:rPr>
+      </w:pPr>
+      <w:proofErr w:type="spellStart"/>
+      <w:r>
+        <w:rPr>
+          <w:rFonts w:ascii="Times New Roman" w:eastAsia="Times New Roman" w:hAnsi="Times New Roman" w:cs="Times New Roman"/>
+          <w:kern w:val="0"/>
+          <w14:ligatures w14:val="none"/>
+        </w:rPr>
+        <w:t>crypto_pipeline_dag</w:t>
+      </w:r>
+      <w:proofErr w:type="spellEnd"/>
+      <w:r>
+        <w:rPr>
+          <w:rFonts w:ascii="Times New Roman" w:eastAsia="Times New Roman" w:hAnsi="Times New Roman" w:cs="Times New Roman"/>
+          <w:kern w:val="0"/>
+          <w14:ligatures w14:val="none"/>
+        </w:rPr>
+        <w:br/>
+        <w:t xml:space="preserve">    ↓</w:t>
+      </w:r>
+      <w:r>
+        <w:rPr>
+          <w:rFonts w:ascii="Times New Roman" w:eastAsia="Times New Roman" w:hAnsi="Times New Roman" w:cs="Times New Roman"/>
+          <w:kern w:val="0"/>
+          <w14:ligatures w14:val="none"/>
+        </w:rPr>
+        <w:br/>
+      </w:r>
+      <w:proofErr w:type="spellStart"/>
+      <w:r>
+        <w:rPr>
+          <w:rFonts w:ascii="Times New Roman" w:eastAsia="Times New Roman" w:hAnsi="Times New Roman" w:cs="Times New Roman"/>
+          <w:kern w:val="0"/>
+          <w14:ligatures w14:val="none"/>
+        </w:rPr>
+        <w:t>extract_task</w:t>
+      </w:r>
+      <w:proofErr w:type="spellEnd"/>
+      <w:r>
+        <w:rPr>
+          <w:rFonts w:ascii="Times New Roman" w:eastAsia="Times New Roman" w:hAnsi="Times New Roman" w:cs="Times New Roman"/>
+          <w:kern w:val="0"/>
+          <w14:ligatures w14:val="none"/>
+        </w:rPr>
+        <w:br/>
+        <w:t xml:space="preserve">    ↓</w:t>
+      </w:r>
+      <w:r>
+        <w:rPr>
+          <w:rFonts w:ascii="Times New Roman" w:eastAsia="Times New Roman" w:hAnsi="Times New Roman" w:cs="Times New Roman"/>
+          <w:kern w:val="0"/>
+          <w14:ligatures w14:val="none"/>
+        </w:rPr>
+        <w:br/>
+      </w:r>
+      <w:proofErr w:type="spellStart"/>
+      <w:r>
+        <w:rPr>
+          <w:rFonts w:ascii="Times New Roman" w:eastAsia="Times New Roman" w:hAnsi="Times New Roman" w:cs="Times New Roman"/>
+          <w:kern w:val="0"/>
+          <w14:ligatures w14:val="none"/>
+        </w:rPr>
+        <w:t>transform_task</w:t>
+      </w:r>
+      <w:proofErr w:type="spellEnd"/>
+      <w:r>
+        <w:rPr>
+          <w:rFonts w:ascii="Times New Roman" w:eastAsia="Times New Roman" w:hAnsi="Times New Roman" w:cs="Times New Roman"/>
+          <w:kern w:val="0"/>
+          <w14:ligatures w14:val="none"/>
+        </w:rPr>
+        <w:br/>
+        <w:t xml:space="preserve">    ↓</w:t>
+      </w:r>
+      <w:r>
+        <w:rPr>
+          <w:rFonts w:ascii="Times New Roman" w:eastAsia="Times New Roman" w:hAnsi="Times New Roman" w:cs="Times New Roman"/>
+          <w:kern w:val="0"/>
+          <w14:ligatures w14:val="none"/>
+        </w:rPr>
+        <w:br/>
+      </w:r>
+      <w:proofErr w:type="spellStart"/>
+      <w:r>
+        <w:rPr>
+          <w:rFonts w:ascii="Times New Roman" w:eastAsia="Times New Roman" w:hAnsi="Times New Roman" w:cs="Times New Roman"/>
+          <w:kern w:val="0"/>
+          <w14:ligatures w14:val="none"/>
+        </w:rPr>
+        <w:t>load_task</w:t>
+      </w:r>
+      <w:proofErr w:type="spellEnd"/>
+    </w:p>
+    <w:p>
+      <w:pPr>
+        <w:spacing w:before="100" w:beforeAutospacing="1" w:after="100" w:afterAutospacing="1" w:line="240" w:lineRule="auto"/>
+        <w:rPr>
+          <w:rFonts w:ascii="Times New Roman" w:eastAsia="Times New Roman" w:hAnsi="Times New Roman" w:cs="Times New Roman"/>
+          <w:b/>
+          <w:bCs/>
+          <w:kern w:val="0"/>
+          <w14:ligatures w14:val="none"/>
+        </w:rPr>
+      </w:pPr>
+      <w:r>
+        <w:rPr>
+          <w:rFonts w:ascii="Times New Roman" w:eastAsia="Times New Roman" w:hAnsi="Times New Roman" w:cs="Times New Roman"/>
+          <w:b/>
+          <w:bCs/>
+          <w:kern w:val="0"/>
+          <w14:ligatures w14:val="none"/>
+        </w:rPr>
+        <w:t>6️</w:t>
+      </w:r>
+      <w:r>
+        <w:rPr>
+          <w:rFonts w:ascii="Segoe UI Symbol" w:eastAsia="Times New Roman" w:hAnsi="Segoe UI Symbol" w:cs="Segoe UI Symbol"/>
+          <w:b/>
+          <w:bCs/>
+          <w:kern w:val="0"/>
+          <w14:ligatures w14:val="none"/>
+        </w:rPr>
+        <w:t>⃣</w:t>
+      </w:r>
+      <w:r>
+        <w:rPr>
+          <w:rFonts w:ascii="Times New Roman" w:eastAsia="Times New Roman" w:hAnsi="Times New Roman" w:cs="Times New Roman"/>
+          <w:b/>
+          <w:bCs/>
+          <w:kern w:val="0"/>
+          <w14:ligatures w14:val="none"/>
+        </w:rPr>
+        <w:t xml:space="preserve"> Final Project Structure</w:t>
+      </w:r>
+    </w:p>
+    <w:p>
+      <w:pPr>
+        <w:spacing w:before="100" w:beforeAutospacing="1" w:after="100" w:afterAutospacing="1" w:line="240" w:lineRule="auto"/>
+        <w:rPr>
+          <w:rFonts w:ascii="Times New Roman" w:eastAsia="Times New Roman" w:hAnsi="Times New Roman" w:cs="Times New Roman"/>
+          <w:kern w:val="0"/>
+          <w14:ligatures w14:val="none"/>
+        </w:rPr>
+      </w:pPr>
+      <w:r>
+        <w:rPr>
+          <w:rFonts w:ascii="Times New Roman" w:eastAsia="Times New Roman" w:hAnsi="Times New Roman" w:cs="Times New Roman"/>
+          <w:kern w:val="0"/>
+          <w14:ligatures w14:val="none"/>
+        </w:rPr>
+        <w:t>Your GitHub project will look like this:</w:t>
+      </w:r>
+    </w:p>
+    <w:p>
+      <w:pPr>
+        <w:spacing w:before="100" w:beforeAutospacing="1" w:after="100" w:afterAutospacing="1" w:line="240" w:lineRule="auto"/>
+        <w:rPr>
+          <w:rFonts w:ascii="Times New Roman" w:eastAsia="Times New Roman" w:hAnsi="Times New Roman" w:cs="Times New Roman"/>
+          <w:kern w:val="0"/>
+          <w14:ligatures w14:val="none"/>
+        </w:rPr>
+      </w:pPr>
+      <w:r>
+        <w:rPr>
+          <w:rFonts w:ascii="Times New Roman" w:eastAsia="Times New Roman" w:hAnsi="Times New Roman" w:cs="Times New Roman"/>
+          <w:kern w:val="0"/>
+          <w14:ligatures w14:val="none"/>
+        </w:rPr>
+        <w:t>crypto-data-engineering-pipeline</w:t>
+      </w:r>
+      <w:r>
+        <w:rPr>
+          <w:rFonts w:ascii="Times New Roman" w:eastAsia="Times New Roman" w:hAnsi="Times New Roman" w:cs="Times New Roman"/>
+          <w:kern w:val="0"/>
+          <w14:ligatures w14:val="none"/>
+        </w:rPr>
+        <w:br/>
+        <w:t>│</w:t>
+      </w:r>
+      <w:r>
+        <w:rPr>
+          <w:rFonts w:ascii="Times New Roman" w:eastAsia="Times New Roman" w:hAnsi="Times New Roman" w:cs="Times New Roman"/>
+          <w:kern w:val="0"/>
+          <w14:ligatures w14:val="none"/>
+        </w:rPr>
+        <w:br/>
+        <w:t xml:space="preserve">├── </w:t>
+      </w:r>
+      <w:proofErr w:type="spellStart"/>
+      <w:r>
+        <w:rPr>
+          <w:rFonts w:ascii="Times New Roman" w:eastAsia="Times New Roman" w:hAnsi="Times New Roman" w:cs="Times New Roman"/>
+          <w:kern w:val="0"/>
+          <w14:ligatures w14:val="none"/>
+        </w:rPr>
+        <w:t>dags</w:t>
+      </w:r>
+      <w:proofErr w:type="spellEnd"/>
+      <w:r>
+        <w:rPr>
+          <w:rFonts w:ascii="Times New Roman" w:eastAsia="Times New Roman" w:hAnsi="Times New Roman" w:cs="Times New Roman"/>
+          <w:kern w:val="0"/>
+          <w14:ligatures w14:val="none"/>
+        </w:rPr>
+        <w:br/>
+        <w:t>│   └── crypto_pipeline_dag.py</w:t>
+      </w:r>
+      <w:r>
+        <w:rPr>
+          <w:rFonts w:ascii="Times New Roman" w:eastAsia="Times New Roman" w:hAnsi="Times New Roman" w:cs="Times New Roman"/>
+          <w:kern w:val="0"/>
+          <w14:ligatures w14:val="none"/>
+        </w:rPr>
+        <w:br/>
+        <w:t>│</w:t>
+      </w:r>
+      <w:r>
+        <w:rPr>
+          <w:rFonts w:ascii="Times New Roman" w:eastAsia="Times New Roman" w:hAnsi="Times New Roman" w:cs="Times New Roman"/>
+          <w:kern w:val="0"/>
+          <w14:ligatures w14:val="none"/>
+        </w:rPr>
+        <w:br/>
+        <w:t>├── scripts</w:t>
+      </w:r>
+      <w:r>
+        <w:rPr>
+          <w:rFonts w:ascii="Times New Roman" w:eastAsia="Times New Roman" w:hAnsi="Times New Roman" w:cs="Times New Roman"/>
+          <w:kern w:val="0"/>
+          <w14:ligatures w14:val="none"/>
+        </w:rPr>
+        <w:br/>
+        <w:t>│   ├── extract.py</w:t>
+      </w:r>
+      <w:r>
+        <w:rPr>
+          <w:rFonts w:ascii="Times New Roman" w:eastAsia="Times New Roman" w:hAnsi="Times New Roman" w:cs="Times New Roman"/>
+          <w:kern w:val="0"/>
+          <w14:ligatures w14:val="none"/>
+        </w:rPr>
+        <w:br/>
+        <w:t>│   ├── transform.py</w:t>
+      </w:r>
+      <w:r>
+        <w:rPr>
+          <w:rFonts w:ascii="Times New Roman" w:eastAsia="Times New Roman" w:hAnsi="Times New Roman" w:cs="Times New Roman"/>
+          <w:kern w:val="0"/>
+          <w14:ligatures w14:val="none"/>
+        </w:rPr>
+        <w:br/>
+        <w:t>│   └── load.py</w:t>
+      </w:r>
+      <w:r>
+        <w:rPr>
+          <w:rFonts w:ascii="Times New Roman" w:eastAsia="Times New Roman" w:hAnsi="Times New Roman" w:cs="Times New Roman"/>
+          <w:kern w:val="0"/>
+          <w14:ligatures w14:val="none"/>
+        </w:rPr>
+        <w:br/>
+        <w:t>│</w:t>
+      </w:r>
+      <w:r>
+        <w:rPr>
+          <w:rFonts w:ascii="Times New Roman" w:eastAsia="Times New Roman" w:hAnsi="Times New Roman" w:cs="Times New Roman"/>
+          <w:kern w:val="0"/>
+          <w14:ligatures w14:val="none"/>
+        </w:rPr>
+        <w:br/>
+        <w:t>├── database</w:t>
+      </w:r>
+      <w:r>
+        <w:rPr>
+          <w:rFonts w:ascii="Times New Roman" w:eastAsia="Times New Roman" w:hAnsi="Times New Roman" w:cs="Times New Roman"/>
+          <w:kern w:val="0"/>
+          <w14:ligatures w14:val="none"/>
+        </w:rPr>
+        <w:br/>
+        <w:t xml:space="preserve">│   └── </w:t>
+      </w:r>
+      <w:proofErr w:type="spellStart"/>
+      <w:r>
+        <w:rPr>
+          <w:rFonts w:ascii="Times New Roman" w:eastAsia="Times New Roman" w:hAnsi="Times New Roman" w:cs="Times New Roman"/>
+          <w:kern w:val="0"/>
+          <w14:ligatures w14:val="none"/>
+        </w:rPr>
+        <w:t>schema.sql</w:t>
+      </w:r>
+      <w:proofErr w:type="spellEnd"/>
+      <w:r>
+        <w:rPr>
+          <w:rFonts w:ascii="Times New Roman" w:eastAsia="Times New Roman" w:hAnsi="Times New Roman" w:cs="Times New Roman"/>
+          <w:kern w:val="0"/>
+          <w14:ligatures w14:val="none"/>
+        </w:rPr>
+        <w:br/>
+        <w:t>│</w:t>
+      </w:r>
+      <w:r>
+        <w:rPr>
+          <w:rFonts w:ascii="Times New Roman" w:eastAsia="Times New Roman" w:hAnsi="Times New Roman" w:cs="Times New Roman"/>
+          <w:kern w:val="0"/>
+          <w14:ligatures w14:val="none"/>
+        </w:rPr>
+        <w:br/>
+        <w:t>├── docker</w:t>
+      </w:r>
+      <w:r>
+        <w:rPr>
+          <w:rFonts w:ascii="Times New Roman" w:eastAsia="Times New Roman" w:hAnsi="Times New Roman" w:cs="Times New Roman"/>
+          <w:kern w:val="0"/>
+          <w14:ligatures w14:val="none"/>
+        </w:rPr>
+        <w:br/>
+        <w:t>│   └── docker-</w:t>
+      </w:r>
+      <w:proofErr w:type="spellStart"/>
+      <w:r>
+        <w:rPr>
+          <w:rFonts w:ascii="Times New Roman" w:eastAsia="Times New Roman" w:hAnsi="Times New Roman" w:cs="Times New Roman"/>
+          <w:kern w:val="0"/>
+          <w14:ligatures w14:val="none"/>
+        </w:rPr>
+        <w:t>compose.yml</w:t>
+      </w:r>
+      <w:proofErr w:type="spellEnd"/>
+      <w:r>
+        <w:rPr>
+          <w:rFonts w:ascii="Times New Roman" w:eastAsia="Times New Roman" w:hAnsi="Times New Roman" w:cs="Times New Roman"/>
+          <w:kern w:val="0"/>
+          <w14:ligatures w14:val="none"/>
+        </w:rPr>
+        <w:br/>
+        <w:t>│</w:t>
+      </w:r>
+      <w:r>
+        <w:rPr>
+          <w:rFonts w:ascii="Times New Roman" w:eastAsia="Times New Roman" w:hAnsi="Times New Roman" w:cs="Times New Roman"/>
+          <w:kern w:val="0"/>
+          <w14:ligatures w14:val="none"/>
+        </w:rPr>
+        <w:br/>
+        <w:t>├── README.md</w:t>
+      </w:r>
+      <w:r>
+        <w:rPr>
+          <w:rFonts w:ascii="Times New Roman" w:eastAsia="Times New Roman" w:hAnsi="Times New Roman" w:cs="Times New Roman"/>
+          <w:kern w:val="0"/>
+          <w14:ligatures w14:val="none"/>
+        </w:rPr>
+        <w:br/>
+        <w:t>└── requirements.txt</w:t>
+      </w:r>
+    </w:p>
+    <w:p>
+      <w:pPr>
+        <w:spacing w:before="100" w:beforeAutospacing="1" w:after="100" w:afterAutospacing="1" w:line="240" w:lineRule="auto"/>
+        <w:rPr>
+          <w:rFonts w:ascii="Times New Roman" w:eastAsia="Times New Roman" w:hAnsi="Times New Roman" w:cs="Times New Roman"/>
+          <w:kern w:val="0"/>
+          <w14:ligatures w14:val="none"/>
+        </w:rPr>
+      </w:pPr>
+      <w:r>
+        <w:rPr>
+          <w:rFonts w:ascii="Times New Roman" w:eastAsia="Times New Roman" w:hAnsi="Times New Roman" w:cs="Times New Roman"/>
+          <w:kern w:val="0"/>
+          <w14:ligatures w14:val="none"/>
+        </w:rPr>
+        <w:t xml:space="preserve">This structure already looks </w:t>
+      </w:r>
+      <w:r>
+        <w:rPr>
+          <w:rFonts w:ascii="Times New Roman" w:eastAsia="Times New Roman" w:hAnsi="Times New Roman" w:cs="Times New Roman"/>
+          <w:b/>
+          <w:bCs/>
+          <w:kern w:val="0"/>
+          <w14:ligatures w14:val="none"/>
+        </w:rPr>
+        <w:t>very close to real production repositories</w:t>
+      </w:r>
+      <w:r>
+        <w:rPr>
+          <w:rFonts w:ascii="Times New Roman" w:eastAsia="Times New Roman" w:hAnsi="Times New Roman" w:cs="Times New Roman"/>
+          <w:kern w:val="0"/>
+          <w14:ligatures w14:val="none"/>
+        </w:rPr>
+        <w:t>.</w:t>
+      </w:r>
+    </w:p>
+    <w:p>
+      <w:pPr>
+        <w:spacing w:before="100" w:beforeAutospacing="1" w:after="100" w:afterAutospacing="1" w:line="240" w:lineRule="auto"/>
+        <w:rPr>
+          <w:rFonts w:ascii="Times New Roman" w:eastAsia="Times New Roman" w:hAnsi="Times New Roman" w:cs="Times New Roman"/>
+          <w:kern w:val="0"/>
+          <w14:ligatures w14:val="none"/>
+        </w:rPr>
+      </w:pPr>
+      <w:r>
+        <w:rPr>
+          <w:rFonts w:ascii="Times New Roman" w:eastAsia="Times New Roman" w:hAnsi="Times New Roman" w:cs="Times New Roman"/>
+          <w:kern w:val="0"/>
+          <w14:ligatures w14:val="none"/>
+        </w:rPr>
+        <w:pict w14:anchorId="4C6F52BD">
+          <v:rect id="_x0000_i1066" style="width:0;height:1.5pt" o:hralign="center" o:hrstd="t" o:hr="t" fillcolor="#a0a0a0" stroked="f"/>
+        </w:pict>
+      </w:r>
+    </w:p>
+    <w:p>
+      <w:pPr>
+        <w:spacing w:before="100" w:beforeAutospacing="1" w:after="100" w:afterAutospacing="1" w:line="240" w:lineRule="auto"/>
+        <w:rPr>
+          <w:rFonts w:ascii="Times New Roman" w:eastAsia="Times New Roman" w:hAnsi="Times New Roman" w:cs="Times New Roman"/>
+          <w:b/>
+          <w:bCs/>
+          <w:kern w:val="0"/>
+          <w14:ligatures w14:val="none"/>
+        </w:rPr>
+      </w:pPr>
+      <w:r>
+        <w:rPr>
+          <w:rFonts w:ascii="Times New Roman" w:eastAsia="Times New Roman" w:hAnsi="Times New Roman" w:cs="Times New Roman"/>
+          <w:b/>
+          <w:bCs/>
+          <w:kern w:val="0"/>
+          <w14:ligatures w14:val="none"/>
+        </w:rPr>
+        <w:t>7️</w:t>
+      </w:r>
+      <w:r>
+        <w:rPr>
+          <w:rFonts w:ascii="Segoe UI Symbol" w:eastAsia="Times New Roman" w:hAnsi="Segoe UI Symbol" w:cs="Segoe UI Symbol"/>
+          <w:b/>
+          <w:bCs/>
+          <w:kern w:val="0"/>
+          <w14:ligatures w14:val="none"/>
+        </w:rPr>
+        <w:t>⃣</w:t>
+      </w:r>
+      <w:r>
+        <w:rPr>
+          <w:rFonts w:ascii="Times New Roman" w:eastAsia="Times New Roman" w:hAnsi="Times New Roman" w:cs="Times New Roman"/>
+          <w:b/>
+          <w:bCs/>
+          <w:kern w:val="0"/>
+          <w14:ligatures w14:val="none"/>
+        </w:rPr>
+        <w:t xml:space="preserve"> Optional Upgrade (Very Impressive)</w:t>
+      </w:r>
+    </w:p>
+    <w:p>
+      <w:pPr>
+        <w:spacing w:before="100" w:beforeAutospacing="1" w:after="100" w:afterAutospacing="1" w:line="240" w:lineRule="auto"/>
+        <w:rPr>
+          <w:rFonts w:ascii="Times New Roman" w:eastAsia="Times New Roman" w:hAnsi="Times New Roman" w:cs="Times New Roman"/>
+          <w:kern w:val="0"/>
+          <w14:ligatures w14:val="none"/>
+        </w:rPr>
+      </w:pPr>
+      <w:r>
+        <w:rPr>
+          <w:rFonts w:ascii="Times New Roman" w:eastAsia="Times New Roman" w:hAnsi="Times New Roman" w:cs="Times New Roman"/>
+          <w:kern w:val="0"/>
+          <w14:ligatures w14:val="none"/>
+        </w:rPr>
+        <w:t>You can run the whole system with:</w:t>
+      </w:r>
+    </w:p>
+    <w:p>
+      <w:pPr>
+        <w:spacing w:before="100" w:beforeAutospacing="1" w:after="100" w:afterAutospacing="1" w:line="240" w:lineRule="auto"/>
+        <w:rPr>
+          <w:rFonts w:ascii="Times New Roman" w:eastAsia="Times New Roman" w:hAnsi="Times New Roman" w:cs="Times New Roman"/>
+          <w:kern w:val="0"/>
+          <w14:ligatures w14:val="none"/>
+        </w:rPr>
+      </w:pPr>
+      <w:r>
+        <w:rPr>
+          <w:rFonts w:ascii="Times New Roman" w:eastAsia="Times New Roman" w:hAnsi="Times New Roman" w:cs="Times New Roman"/>
+          <w:kern w:val="0"/>
+          <w14:ligatures w14:val="none"/>
+        </w:rPr>
+        <w:t>Docker</w:t>
+      </w:r>
+    </w:p>
+    <w:p>
+      <w:pPr>
+        <w:spacing w:before="100" w:beforeAutospacing="1" w:after="100" w:afterAutospacing="1" w:line="240" w:lineRule="auto"/>
+        <w:rPr>
+          <w:rFonts w:ascii="Times New Roman" w:eastAsia="Times New Roman" w:hAnsi="Times New Roman" w:cs="Times New Roman"/>
+          <w:kern w:val="0"/>
+          <w14:ligatures w14:val="none"/>
+        </w:rPr>
+      </w:pPr>
+      <w:r>
+        <w:rPr>
+          <w:rFonts w:ascii="Times New Roman" w:eastAsia="Times New Roman" w:hAnsi="Times New Roman" w:cs="Times New Roman"/>
+          <w:kern w:val="0"/>
+          <w14:ligatures w14:val="none"/>
+        </w:rPr>
+        <w:t>Example:</w:t>
+      </w:r>
+    </w:p>
+    <w:p>
+      <w:pPr>
+        <w:spacing w:before="100" w:beforeAutospacing="1" w:after="100" w:afterAutospacing="1" w:line="240" w:lineRule="auto"/>
+        <w:rPr>
+          <w:rFonts w:ascii="Times New Roman" w:eastAsia="Times New Roman" w:hAnsi="Times New Roman" w:cs="Times New Roman"/>
+          <w:kern w:val="0"/>
+          <w14:ligatures w14:val="none"/>
+        </w:rPr>
+      </w:pPr>
+      <w:r>
+        <w:rPr>
+          <w:rFonts w:ascii="Times New Roman" w:eastAsia="Times New Roman" w:hAnsi="Times New Roman" w:cs="Times New Roman"/>
+          <w:kern w:val="0"/>
+          <w14:ligatures w14:val="none"/>
+        </w:rPr>
+        <w:lastRenderedPageBreak/>
+        <w:t>Docker containers</w:t>
+      </w:r>
+      <w:r>
+        <w:rPr>
+          <w:rFonts w:ascii="Times New Roman" w:eastAsia="Times New Roman" w:hAnsi="Times New Roman" w:cs="Times New Roman"/>
+          <w:kern w:val="0"/>
+          <w14:ligatures w14:val="none"/>
+        </w:rPr>
+        <w:br/>
+        <w:t xml:space="preserve"> ├── Airflow</w:t>
+      </w:r>
+      <w:r>
+        <w:rPr>
+          <w:rFonts w:ascii="Times New Roman" w:eastAsia="Times New Roman" w:hAnsi="Times New Roman" w:cs="Times New Roman"/>
+          <w:kern w:val="0"/>
+          <w14:ligatures w14:val="none"/>
+        </w:rPr>
+        <w:br/>
+        <w:t xml:space="preserve"> ├── PostgreSQL</w:t>
+      </w:r>
+      <w:r>
+        <w:rPr>
+          <w:rFonts w:ascii="Times New Roman" w:eastAsia="Times New Roman" w:hAnsi="Times New Roman" w:cs="Times New Roman"/>
+          <w:kern w:val="0"/>
+          <w14:ligatures w14:val="none"/>
+        </w:rPr>
+        <w:br/>
+        <w:t xml:space="preserve"> └── ETL pipeline</w:t>
+      </w:r>
+    </w:p>
+    <w:p>
+      <w:pPr>
+        <w:spacing w:before="100" w:beforeAutospacing="1" w:after="100" w:afterAutospacing="1" w:line="240" w:lineRule="auto"/>
+        <w:rPr>
+          <w:rFonts w:ascii="Times New Roman" w:eastAsia="Times New Roman" w:hAnsi="Times New Roman" w:cs="Times New Roman"/>
+          <w:kern w:val="0"/>
+          <w14:ligatures w14:val="none"/>
+        </w:rPr>
+      </w:pPr>
+      <w:r>
+        <w:rPr>
+          <w:rFonts w:ascii="Times New Roman" w:eastAsia="Times New Roman" w:hAnsi="Times New Roman" w:cs="Times New Roman"/>
+          <w:kern w:val="0"/>
+          <w14:ligatures w14:val="none"/>
+        </w:rPr>
+        <w:t>Tool:</w:t>
+      </w:r>
+    </w:p>
+    <w:p>
+      <w:pPr>
+        <w:numPr>
+          <w:ilvl w:val="0"/>
+          <w:numId w:val="26"/>
+        </w:numPr>
+        <w:spacing w:before="100" w:beforeAutospacing="1" w:after="100" w:afterAutospacing="1" w:line="240" w:lineRule="auto"/>
+        <w:rPr>
+          <w:rFonts w:ascii="Times New Roman" w:eastAsia="Times New Roman" w:hAnsi="Times New Roman" w:cs="Times New Roman"/>
+          <w:kern w:val="0"/>
+          <w14:ligatures w14:val="none"/>
+        </w:rPr>
+      </w:pPr>
+      <w:r>
+        <w:rPr>
+          <w:rFonts w:ascii="Times New Roman" w:eastAsia="Times New Roman" w:hAnsi="Times New Roman" w:cs="Times New Roman"/>
+          <w:kern w:val="0"/>
+          <w14:ligatures w14:val="none"/>
+        </w:rPr>
+        <w:t>Docker</w:t>
+      </w:r>
+    </w:p>
+    <w:p>
+      <w:pPr>
+        <w:spacing w:before="100" w:beforeAutospacing="1" w:after="100" w:afterAutospacing="1" w:line="240" w:lineRule="auto"/>
+        <w:rPr>
+          <w:rFonts w:ascii="Times New Roman" w:eastAsia="Times New Roman" w:hAnsi="Times New Roman" w:cs="Times New Roman"/>
+          <w:kern w:val="0"/>
+          <w14:ligatures w14:val="none"/>
+        </w:rPr>
+      </w:pPr>
+      <w:r>
+        <w:rPr>
+          <w:rFonts w:ascii="Times New Roman" w:eastAsia="Times New Roman" w:hAnsi="Times New Roman" w:cs="Times New Roman"/>
+          <w:kern w:val="0"/>
+          <w14:ligatures w14:val="none"/>
+        </w:rPr>
+        <w:t xml:space="preserve">Many data engineering internships love seeing </w:t>
+      </w:r>
+      <w:r>
+        <w:rPr>
+          <w:rFonts w:ascii="Times New Roman" w:eastAsia="Times New Roman" w:hAnsi="Times New Roman" w:cs="Times New Roman"/>
+          <w:b/>
+          <w:bCs/>
+          <w:kern w:val="0"/>
+          <w14:ligatures w14:val="none"/>
+        </w:rPr>
+        <w:t>Docker + Airflow + PostgreSQL</w:t>
+      </w:r>
+      <w:r>
+        <w:rPr>
+          <w:rFonts w:ascii="Times New Roman" w:eastAsia="Times New Roman" w:hAnsi="Times New Roman" w:cs="Times New Roman"/>
+          <w:kern w:val="0"/>
+          <w14:ligatures w14:val="none"/>
+        </w:rPr>
+        <w:t>.</w:t>
       </w:r>
     </w:p>
     <w:p>
@@ -4889,6 +6828,155 @@
     </w:lvl>
   </w:abstractNum>
   <w:abstractNum w:abstractNumId="12" w15:restartNumberingAfterBreak="0">
+    <w:nsid w:val="4B2F7C65"/>
+    <w:multiLevelType w:val="multilevel"/>
+    <w:tmpl w:val="110C4ED8"/>
+    <w:lvl w:ilvl="0">
+      <w:start w:val="1"/>
+      <w:numFmt w:val="bullet"/>
+      <w:lvlText w:val=""/>
+      <w:lvlJc w:val="left"/>
+      <w:pPr>
+        <w:tabs>
+          <w:tab w:val="num" w:pos="720"/>
+        </w:tabs>
+        <w:ind w:left="720" w:hanging="360"/>
+      </w:pPr>
+      <w:rPr>
+        <w:rFonts w:ascii="Symbol" w:hAnsi="Symbol" w:hint="default"/>
+        <w:sz w:val="20"/>
+      </w:rPr>
+    </w:lvl>
+    <w:lvl w:ilvl="1" w:tentative="1">
+      <w:start w:val="1"/>
+      <w:numFmt w:val="bullet"/>
+      <w:lvlText w:val="o"/>
+      <w:lvlJc w:val="left"/>
+      <w:pPr>
+        <w:tabs>
+          <w:tab w:val="num" w:pos="1440"/>
+        </w:tabs>
+        <w:ind w:left="1440" w:hanging="360"/>
+      </w:pPr>
+      <w:rPr>
+        <w:rFonts w:ascii="Courier New" w:hAnsi="Courier New" w:hint="default"/>
+        <w:sz w:val="20"/>
+      </w:rPr>
+    </w:lvl>
+    <w:lvl w:ilvl="2" w:tentative="1">
+      <w:start w:val="1"/>
+      <w:numFmt w:val="bullet"/>
+      <w:lvlText w:val=""/>
+      <w:lvlJc w:val="left"/>
+      <w:pPr>
+        <w:tabs>
+          <w:tab w:val="num" w:pos="2160"/>
+        </w:tabs>
+        <w:ind w:left="2160" w:hanging="360"/>
+      </w:pPr>
+      <w:rPr>
+        <w:rFonts w:ascii="Wingdings" w:hAnsi="Wingdings" w:hint="default"/>
+        <w:sz w:val="20"/>
+      </w:rPr>
+    </w:lvl>
+    <w:lvl w:ilvl="3" w:tentative="1">
+      <w:start w:val="1"/>
+      <w:numFmt w:val="bullet"/>
+      <w:lvlText w:val=""/>
+      <w:lvlJc w:val="left"/>
+      <w:pPr>
+        <w:tabs>
+          <w:tab w:val="num" w:pos="2880"/>
+        </w:tabs>
+        <w:ind w:left="2880" w:hanging="360"/>
+      </w:pPr>
+      <w:rPr>
+        <w:rFonts w:ascii="Wingdings" w:hAnsi="Wingdings" w:hint="default"/>
+        <w:sz w:val="20"/>
+      </w:rPr>
+    </w:lvl>
+    <w:lvl w:ilvl="4" w:tentative="1">
+      <w:start w:val="1"/>
+      <w:numFmt w:val="bullet"/>
+      <w:lvlText w:val=""/>
+      <w:lvlJc w:val="left"/>
+      <w:pPr>
+        <w:tabs>
+          <w:tab w:val="num" w:pos="3600"/>
+        </w:tabs>
+        <w:ind w:left="3600" w:hanging="360"/>
+      </w:pPr>
+      <w:rPr>
+        <w:rFonts w:ascii="Wingdings" w:hAnsi="Wingdings" w:hint="default"/>
+        <w:sz w:val="20"/>
+      </w:rPr>
+    </w:lvl>
+    <w:lvl w:ilvl="5" w:tentative="1">
+      <w:start w:val="1"/>
+      <w:numFmt w:val="bullet"/>
+      <w:lvlText w:val=""/>
+      <w:lvlJc w:val="left"/>
+      <w:pPr>
+        <w:tabs>
+          <w:tab w:val="num" w:pos="4320"/>
+        </w:tabs>
+        <w:ind w:left="4320" w:hanging="360"/>
+      </w:pPr>
+      <w:rPr>
+        <w:rFonts w:ascii="Wingdings" w:hAnsi="Wingdings" w:hint="default"/>
+        <w:sz w:val="20"/>
+      </w:rPr>
+    </w:lvl>
+    <w:lvl w:ilvl="6" w:tentative="1">
+      <w:start w:val="1"/>
+      <w:numFmt w:val="bullet"/>
+      <w:lvlText w:val=""/>
+      <w:lvlJc w:val="left"/>
+      <w:pPr>
+        <w:tabs>
+          <w:tab w:val="num" w:pos="5040"/>
+        </w:tabs>
+        <w:ind w:left="5040" w:hanging="360"/>
+      </w:pPr>
+      <w:rPr>
+        <w:rFonts w:ascii="Wingdings" w:hAnsi="Wingdings" w:hint="default"/>
+        <w:sz w:val="20"/>
+      </w:rPr>
+    </w:lvl>
+    <w:lvl w:ilvl="7" w:tentative="1">
+      <w:start w:val="1"/>
+      <w:numFmt w:val="bullet"/>
+      <w:lvlText w:val=""/>
+      <w:lvlJc w:val="left"/>
+      <w:pPr>
+        <w:tabs>
+          <w:tab w:val="num" w:pos="5760"/>
+        </w:tabs>
+        <w:ind w:left="5760" w:hanging="360"/>
+      </w:pPr>
+      <w:rPr>
+        <w:rFonts w:ascii="Wingdings" w:hAnsi="Wingdings" w:hint="default"/>
+        <w:sz w:val="20"/>
+      </w:rPr>
+    </w:lvl>
+    <w:lvl w:ilvl="8" w:tentative="1">
+      <w:start w:val="1"/>
+      <w:numFmt w:val="bullet"/>
+      <w:lvlText w:val=""/>
+      <w:lvlJc w:val="left"/>
+      <w:pPr>
+        <w:tabs>
+          <w:tab w:val="num" w:pos="6480"/>
+        </w:tabs>
+        <w:ind w:left="6480" w:hanging="360"/>
+      </w:pPr>
+      <w:rPr>
+        <w:rFonts w:ascii="Wingdings" w:hAnsi="Wingdings" w:hint="default"/>
+        <w:sz w:val="20"/>
+      </w:rPr>
+    </w:lvl>
+  </w:abstractNum>
+  <w:abstractNum w:abstractNumId="13" w15:restartNumberingAfterBreak="0">
     <w:nsid w:val="4B5B2B5C"/>
     <w:multiLevelType w:val="multilevel"/>
     <w:tmpl w:val="299A75E8"/>
@@ -5037,7 +7125,7 @@
       </w:rPr>
     </w:lvl>
   </w:abstractNum>
-  <w:abstractNum w:abstractNumId="13" w15:restartNumberingAfterBreak="0">
+  <w:abstractNum w:abstractNumId="14" w15:restartNumberingAfterBreak="0">
     <w:nsid w:val="50285661"/>
     <w:multiLevelType w:val="multilevel"/>
     <w:tmpl w:val="2A485456"/>
@@ -5186,7 +7274,7 @@
       </w:rPr>
     </w:lvl>
   </w:abstractNum>
-  <w:abstractNum w:abstractNumId="14" w15:restartNumberingAfterBreak="0">
+  <w:abstractNum w:abstractNumId="15" w15:restartNumberingAfterBreak="0">
     <w:nsid w:val="54A0535A"/>
     <w:multiLevelType w:val="multilevel"/>
     <w:tmpl w:val="BDAE55B4"/>
@@ -5335,7 +7423,156 @@
       </w:rPr>
     </w:lvl>
   </w:abstractNum>
-  <w:abstractNum w:abstractNumId="15" w15:restartNumberingAfterBreak="0">
+  <w:abstractNum w:abstractNumId="16" w15:restartNumberingAfterBreak="0">
+    <w:nsid w:val="56E14683"/>
+    <w:multiLevelType w:val="multilevel"/>
+    <w:tmpl w:val="854407F4"/>
+    <w:lvl w:ilvl="0">
+      <w:start w:val="1"/>
+      <w:numFmt w:val="bullet"/>
+      <w:lvlText w:val=""/>
+      <w:lvlJc w:val="left"/>
+      <w:pPr>
+        <w:tabs>
+          <w:tab w:val="num" w:pos="720"/>
+        </w:tabs>
+        <w:ind w:left="720" w:hanging="360"/>
+      </w:pPr>
+      <w:rPr>
+        <w:rFonts w:ascii="Symbol" w:hAnsi="Symbol" w:hint="default"/>
+        <w:sz w:val="20"/>
+      </w:rPr>
+    </w:lvl>
+    <w:lvl w:ilvl="1" w:tentative="1">
+      <w:start w:val="1"/>
+      <w:numFmt w:val="bullet"/>
+      <w:lvlText w:val="o"/>
+      <w:lvlJc w:val="left"/>
+      <w:pPr>
+        <w:tabs>
+          <w:tab w:val="num" w:pos="1440"/>
+        </w:tabs>
+        <w:ind w:left="1440" w:hanging="360"/>
+      </w:pPr>
+      <w:rPr>
+        <w:rFonts w:ascii="Courier New" w:hAnsi="Courier New" w:hint="default"/>
+        <w:sz w:val="20"/>
+      </w:rPr>
+    </w:lvl>
+    <w:lvl w:ilvl="2" w:tentative="1">
+      <w:start w:val="1"/>
+      <w:numFmt w:val="bullet"/>
+      <w:lvlText w:val=""/>
+      <w:lvlJc w:val="left"/>
+      <w:pPr>
+        <w:tabs>
+          <w:tab w:val="num" w:pos="2160"/>
+        </w:tabs>
+        <w:ind w:left="2160" w:hanging="360"/>
+      </w:pPr>
+      <w:rPr>
+        <w:rFonts w:ascii="Wingdings" w:hAnsi="Wingdings" w:hint="default"/>
+        <w:sz w:val="20"/>
+      </w:rPr>
+    </w:lvl>
+    <w:lvl w:ilvl="3" w:tentative="1">
+      <w:start w:val="1"/>
+      <w:numFmt w:val="bullet"/>
+      <w:lvlText w:val=""/>
+      <w:lvlJc w:val="left"/>
+      <w:pPr>
+        <w:tabs>
+          <w:tab w:val="num" w:pos="2880"/>
+        </w:tabs>
+        <w:ind w:left="2880" w:hanging="360"/>
+      </w:pPr>
+      <w:rPr>
+        <w:rFonts w:ascii="Wingdings" w:hAnsi="Wingdings" w:hint="default"/>
+        <w:sz w:val="20"/>
+      </w:rPr>
+    </w:lvl>
+    <w:lvl w:ilvl="4" w:tentative="1">
+      <w:start w:val="1"/>
+      <w:numFmt w:val="bullet"/>
+      <w:lvlText w:val=""/>
+      <w:lvlJc w:val="left"/>
+      <w:pPr>
+        <w:tabs>
+          <w:tab w:val="num" w:pos="3600"/>
+        </w:tabs>
+        <w:ind w:left="3600" w:hanging="360"/>
+      </w:pPr>
+      <w:rPr>
+        <w:rFonts w:ascii="Wingdings" w:hAnsi="Wingdings" w:hint="default"/>
+        <w:sz w:val="20"/>
+      </w:rPr>
+    </w:lvl>
+    <w:lvl w:ilvl="5" w:tentative="1">
+      <w:start w:val="1"/>
+      <w:numFmt w:val="bullet"/>
+      <w:lvlText w:val=""/>
+      <w:lvlJc w:val="left"/>
+      <w:pPr>
+        <w:tabs>
+          <w:tab w:val="num" w:pos="4320"/>
+        </w:tabs>
+        <w:ind w:left="4320" w:hanging="360"/>
+      </w:pPr>
+      <w:rPr>
+        <w:rFonts w:ascii="Wingdings" w:hAnsi="Wingdings" w:hint="default"/>
+        <w:sz w:val="20"/>
+      </w:rPr>
+    </w:lvl>
+    <w:lvl w:ilvl="6" w:tentative="1">
+      <w:start w:val="1"/>
+      <w:numFmt w:val="bullet"/>
+      <w:lvlText w:val=""/>
+      <w:lvlJc w:val="left"/>
+      <w:pPr>
+        <w:tabs>
+          <w:tab w:val="num" w:pos="5040"/>
+        </w:tabs>
+        <w:ind w:left="5040" w:hanging="360"/>
+      </w:pPr>
+      <w:rPr>
+        <w:rFonts w:ascii="Wingdings" w:hAnsi="Wingdings" w:hint="default"/>
+        <w:sz w:val="20"/>
+      </w:rPr>
+    </w:lvl>
+    <w:lvl w:ilvl="7" w:tentative="1">
+      <w:start w:val="1"/>
+      <w:numFmt w:val="bullet"/>
+      <w:lvlText w:val=""/>
+      <w:lvlJc w:val="left"/>
+      <w:pPr>
+        <w:tabs>
+          <w:tab w:val="num" w:pos="5760"/>
+        </w:tabs>
+        <w:ind w:left="5760" w:hanging="360"/>
+      </w:pPr>
+      <w:rPr>
+        <w:rFonts w:ascii="Wingdings" w:hAnsi="Wingdings" w:hint="default"/>
+        <w:sz w:val="20"/>
+      </w:rPr>
+    </w:lvl>
+    <w:lvl w:ilvl="8" w:tentative="1">
+      <w:start w:val="1"/>
+      <w:numFmt w:val="bullet"/>
+      <w:lvlText w:val=""/>
+      <w:lvlJc w:val="left"/>
+      <w:pPr>
+        <w:tabs>
+          <w:tab w:val="num" w:pos="6480"/>
+        </w:tabs>
+        <w:ind w:left="6480" w:hanging="360"/>
+      </w:pPr>
+      <w:rPr>
+        <w:rFonts w:ascii="Wingdings" w:hAnsi="Wingdings" w:hint="default"/>
+        <w:sz w:val="20"/>
+      </w:rPr>
+    </w:lvl>
+  </w:abstractNum>
+  <w:abstractNum w:abstractNumId="17" w15:restartNumberingAfterBreak="0">
     <w:nsid w:val="594270B8"/>
     <w:multiLevelType w:val="multilevel"/>
     <w:tmpl w:val="134800E2"/>
@@ -5484,7 +7721,7 @@
       </w:rPr>
     </w:lvl>
   </w:abstractNum>
-  <w:abstractNum w:abstractNumId="16" w15:restartNumberingAfterBreak="0">
+  <w:abstractNum w:abstractNumId="18" w15:restartNumberingAfterBreak="0">
     <w:nsid w:val="5AD14B34"/>
     <w:multiLevelType w:val="multilevel"/>
     <w:tmpl w:val="C0923508"/>
@@ -5633,7 +7870,7 @@
       </w:rPr>
     </w:lvl>
   </w:abstractNum>
-  <w:abstractNum w:abstractNumId="17" w15:restartNumberingAfterBreak="0">
+  <w:abstractNum w:abstractNumId="19" w15:restartNumberingAfterBreak="0">
     <w:nsid w:val="62120F42"/>
     <w:multiLevelType w:val="multilevel"/>
     <w:tmpl w:val="F2B6D396"/>
@@ -5782,7 +8019,7 @@
       </w:rPr>
     </w:lvl>
   </w:abstractNum>
-  <w:abstractNum w:abstractNumId="18" w15:restartNumberingAfterBreak="0">
+  <w:abstractNum w:abstractNumId="20" w15:restartNumberingAfterBreak="0">
     <w:nsid w:val="6C4E45C6"/>
     <w:multiLevelType w:val="multilevel"/>
     <w:tmpl w:val="1B4A51DA"/>
@@ -5931,7 +8168,7 @@
       </w:rPr>
     </w:lvl>
   </w:abstractNum>
-  <w:abstractNum w:abstractNumId="19" w15:restartNumberingAfterBreak="0">
+  <w:abstractNum w:abstractNumId="21" w15:restartNumberingAfterBreak="0">
     <w:nsid w:val="6E964572"/>
     <w:multiLevelType w:val="multilevel"/>
     <w:tmpl w:val="CC0ED7AE"/>
@@ -6080,7 +8317,7 @@
       </w:rPr>
     </w:lvl>
   </w:abstractNum>
-  <w:abstractNum w:abstractNumId="20" w15:restartNumberingAfterBreak="0">
+  <w:abstractNum w:abstractNumId="22" w15:restartNumberingAfterBreak="0">
     <w:nsid w:val="703329CE"/>
     <w:multiLevelType w:val="multilevel"/>
     <w:tmpl w:val="F9DAE254"/>
@@ -6229,7 +8466,7 @@
       </w:rPr>
     </w:lvl>
   </w:abstractNum>
-  <w:abstractNum w:abstractNumId="21" w15:restartNumberingAfterBreak="0">
+  <w:abstractNum w:abstractNumId="23" w15:restartNumberingAfterBreak="0">
     <w:nsid w:val="764453CA"/>
     <w:multiLevelType w:val="multilevel"/>
     <w:tmpl w:val="75D01198"/>
@@ -6342,7 +8579,156 @@
       </w:pPr>
     </w:lvl>
   </w:abstractNum>
-  <w:abstractNum w:abstractNumId="22" w15:restartNumberingAfterBreak="0">
+  <w:abstractNum w:abstractNumId="24" w15:restartNumberingAfterBreak="0">
+    <w:nsid w:val="7BC20A84"/>
+    <w:multiLevelType w:val="multilevel"/>
+    <w:tmpl w:val="5836A29E"/>
+    <w:lvl w:ilvl="0">
+      <w:start w:val="1"/>
+      <w:numFmt w:val="bullet"/>
+      <w:lvlText w:val=""/>
+      <w:lvlJc w:val="left"/>
+      <w:pPr>
+        <w:tabs>
+          <w:tab w:val="num" w:pos="720"/>
+        </w:tabs>
+        <w:ind w:left="720" w:hanging="360"/>
+      </w:pPr>
+      <w:rPr>
+        <w:rFonts w:ascii="Symbol" w:hAnsi="Symbol" w:hint="default"/>
+        <w:sz w:val="20"/>
+      </w:rPr>
+    </w:lvl>
+    <w:lvl w:ilvl="1" w:tentative="1">
+      <w:start w:val="1"/>
+      <w:numFmt w:val="bullet"/>
+      <w:lvlText w:val="o"/>
+      <w:lvlJc w:val="left"/>
+      <w:pPr>
+        <w:tabs>
+          <w:tab w:val="num" w:pos="1440"/>
+        </w:tabs>
+        <w:ind w:left="1440" w:hanging="360"/>
+      </w:pPr>
+      <w:rPr>
+        <w:rFonts w:ascii="Courier New" w:hAnsi="Courier New" w:hint="default"/>
+        <w:sz w:val="20"/>
+      </w:rPr>
+    </w:lvl>
+    <w:lvl w:ilvl="2" w:tentative="1">
+      <w:start w:val="1"/>
+      <w:numFmt w:val="bullet"/>
+      <w:lvlText w:val=""/>
+      <w:lvlJc w:val="left"/>
+      <w:pPr>
+        <w:tabs>
+          <w:tab w:val="num" w:pos="2160"/>
+        </w:tabs>
+        <w:ind w:left="2160" w:hanging="360"/>
+      </w:pPr>
+      <w:rPr>
+        <w:rFonts w:ascii="Wingdings" w:hAnsi="Wingdings" w:hint="default"/>
+        <w:sz w:val="20"/>
+      </w:rPr>
+    </w:lvl>
+    <w:lvl w:ilvl="3" w:tentative="1">
+      <w:start w:val="1"/>
+      <w:numFmt w:val="bullet"/>
+      <w:lvlText w:val=""/>
+      <w:lvlJc w:val="left"/>
+      <w:pPr>
+        <w:tabs>
+          <w:tab w:val="num" w:pos="2880"/>
+        </w:tabs>
+        <w:ind w:left="2880" w:hanging="360"/>
+      </w:pPr>
+      <w:rPr>
+        <w:rFonts w:ascii="Wingdings" w:hAnsi="Wingdings" w:hint="default"/>
+        <w:sz w:val="20"/>
+      </w:rPr>
+    </w:lvl>
+    <w:lvl w:ilvl="4" w:tentative="1">
+      <w:start w:val="1"/>
+      <w:numFmt w:val="bullet"/>
+      <w:lvlText w:val=""/>
+      <w:lvlJc w:val="left"/>
+      <w:pPr>
+        <w:tabs>
+          <w:tab w:val="num" w:pos="3600"/>
+        </w:tabs>
+        <w:ind w:left="3600" w:hanging="360"/>
+      </w:pPr>
+      <w:rPr>
+        <w:rFonts w:ascii="Wingdings" w:hAnsi="Wingdings" w:hint="default"/>
+        <w:sz w:val="20"/>
+      </w:rPr>
+    </w:lvl>
+    <w:lvl w:ilvl="5" w:tentative="1">
+      <w:start w:val="1"/>
+      <w:numFmt w:val="bullet"/>
+      <w:lvlText w:val=""/>
+      <w:lvlJc w:val="left"/>
+      <w:pPr>
+        <w:tabs>
+          <w:tab w:val="num" w:pos="4320"/>
+        </w:tabs>
+        <w:ind w:left="4320" w:hanging="360"/>
+      </w:pPr>
+      <w:rPr>
+        <w:rFonts w:ascii="Wingdings" w:hAnsi="Wingdings" w:hint="default"/>
+        <w:sz w:val="20"/>
+      </w:rPr>
+    </w:lvl>
+    <w:lvl w:ilvl="6" w:tentative="1">
+      <w:start w:val="1"/>
+      <w:numFmt w:val="bullet"/>
+      <w:lvlText w:val=""/>
+      <w:lvlJc w:val="left"/>
+      <w:pPr>
+        <w:tabs>
+          <w:tab w:val="num" w:pos="5040"/>
+        </w:tabs>
+        <w:ind w:left="5040" w:hanging="360"/>
+      </w:pPr>
+      <w:rPr>
+        <w:rFonts w:ascii="Wingdings" w:hAnsi="Wingdings" w:hint="default"/>
+        <w:sz w:val="20"/>
+      </w:rPr>
+    </w:lvl>
+    <w:lvl w:ilvl="7" w:tentative="1">
+      <w:start w:val="1"/>
+      <w:numFmt w:val="bullet"/>
+      <w:lvlText w:val=""/>
+      <w:lvlJc w:val="left"/>
+      <w:pPr>
+        <w:tabs>
+          <w:tab w:val="num" w:pos="5760"/>
+        </w:tabs>
+        <w:ind w:left="5760" w:hanging="360"/>
+      </w:pPr>
+      <w:rPr>
+        <w:rFonts w:ascii="Wingdings" w:hAnsi="Wingdings" w:hint="default"/>
+        <w:sz w:val="20"/>
+      </w:rPr>
+    </w:lvl>
+    <w:lvl w:ilvl="8" w:tentative="1">
+      <w:start w:val="1"/>
+      <w:numFmt w:val="bullet"/>
+      <w:lvlText w:val=""/>
+      <w:lvlJc w:val="left"/>
+      <w:pPr>
+        <w:tabs>
+          <w:tab w:val="num" w:pos="6480"/>
+        </w:tabs>
+        <w:ind w:left="6480" w:hanging="360"/>
+      </w:pPr>
+      <w:rPr>
+        <w:rFonts w:ascii="Wingdings" w:hAnsi="Wingdings" w:hint="default"/>
+        <w:sz w:val="20"/>
+      </w:rPr>
+    </w:lvl>
+  </w:abstractNum>
+  <w:abstractNum w:abstractNumId="25" w15:restartNumberingAfterBreak="0">
     <w:nsid w:val="7E085D2D"/>
     <w:multiLevelType w:val="multilevel"/>
     <w:tmpl w:val="8BEE95C6"/>
@@ -6495,7 +8881,7 @@
     <w:abstractNumId w:val="4"/>
   </w:num>
   <w:num w:numId="2" w16cid:durableId="591087668">
-    <w:abstractNumId w:val="21"/>
+    <w:abstractNumId w:val="23"/>
   </w:num>
   <w:num w:numId="3" w16cid:durableId="96558184">
     <w:abstractNumId w:val="9"/>
@@ -6507,7 +8893,7 @@
     <w:abstractNumId w:val="0"/>
   </w:num>
   <w:num w:numId="6" w16cid:durableId="1414470372">
-    <w:abstractNumId w:val="18"/>
+    <w:abstractNumId w:val="20"/>
   </w:num>
   <w:num w:numId="7" w16cid:durableId="1601134015">
     <w:abstractNumId w:val="1"/>
@@ -6516,10 +8902,10 @@
     <w:abstractNumId w:val="5"/>
   </w:num>
   <w:num w:numId="9" w16cid:durableId="1930653832">
-    <w:abstractNumId w:val="13"/>
+    <w:abstractNumId w:val="14"/>
   </w:num>
   <w:num w:numId="10" w16cid:durableId="629288249">
-    <w:abstractNumId w:val="20"/>
+    <w:abstractNumId w:val="22"/>
   </w:num>
   <w:num w:numId="11" w16cid:durableId="1571773577">
     <w:abstractNumId w:val="3"/>
@@ -6534,31 +8920,40 @@
     <w:abstractNumId w:val="8"/>
   </w:num>
   <w:num w:numId="15" w16cid:durableId="962349849">
-    <w:abstractNumId w:val="22"/>
+    <w:abstractNumId w:val="25"/>
   </w:num>
   <w:num w:numId="16" w16cid:durableId="845900248">
-    <w:abstractNumId w:val="14"/>
+    <w:abstractNumId w:val="15"/>
   </w:num>
   <w:num w:numId="17" w16cid:durableId="1336688956">
-    <w:abstractNumId w:val="17"/>
+    <w:abstractNumId w:val="19"/>
   </w:num>
   <w:num w:numId="18" w16cid:durableId="1359047540">
-    <w:abstractNumId w:val="12"/>
+    <w:abstractNumId w:val="13"/>
   </w:num>
   <w:num w:numId="19" w16cid:durableId="1834567449">
     <w:abstractNumId w:val="2"/>
   </w:num>
   <w:num w:numId="20" w16cid:durableId="726221257">
-    <w:abstractNumId w:val="15"/>
+    <w:abstractNumId w:val="17"/>
   </w:num>
   <w:num w:numId="21" w16cid:durableId="1392383602">
-    <w:abstractNumId w:val="19"/>
+    <w:abstractNumId w:val="21"/>
   </w:num>
   <w:num w:numId="22" w16cid:durableId="1944066133">
-    <w:abstractNumId w:val="16"/>
+    <w:abstractNumId w:val="18"/>
   </w:num>
   <w:num w:numId="23" w16cid:durableId="1056971488">
     <w:abstractNumId w:val="11"/>
+  </w:num>
+  <w:num w:numId="24" w16cid:durableId="599148091">
+    <w:abstractNumId w:val="12"/>
+  </w:num>
+  <w:num w:numId="25" w16cid:durableId="285157399">
+    <w:abstractNumId w:val="24"/>
+  </w:num>
+  <w:num w:numId="26" w16cid:durableId="1327049505">
+    <w:abstractNumId w:val="16"/>
   </w:num>
 </w:numbering>
 </file>

</xml_diff>